<commit_message>
Mise à jour globale du projet
</commit_message>
<xml_diff>
--- a/Instruction_All_Project.docx
+++ b/Instruction_All_Project.docx
@@ -1,6 +1,6 @@
 
 <file path=word/document.xml><?xml version="1.0" encoding="utf-8"?>
-<w:document xmlns:wpc="http://schemas.microsoft.com/office/word/2010/wordprocessingCanvas" xmlns:cx="http://schemas.microsoft.com/office/drawing/2014/chartex" xmlns:cx1="http://schemas.microsoft.com/office/drawing/2015/9/8/chartex" xmlns:cx2="http://schemas.microsoft.com/office/drawing/2015/10/21/chartex" xmlns:cx3="http://schemas.microsoft.com/office/drawing/2016/5/9/chartex" xmlns:cx4="http://schemas.microsoft.com/office/drawing/2016/5/10/chartex" xmlns:cx5="http://schemas.microsoft.com/office/drawing/2016/5/11/chartex" xmlns:cx6="http://schemas.microsoft.com/office/drawing/2016/5/12/chartex" xmlns:cx7="http://schemas.microsoft.com/office/drawing/2016/5/13/chartex" xmlns:cx8="http://schemas.microsoft.com/office/drawing/2016/5/14/chartex" xmlns:mc="http://schemas.openxmlformats.org/markup-compatibility/2006" xmlns:aink="http://schemas.microsoft.com/office/drawing/2016/ink" xmlns:am3d="http://schemas.microsoft.com/office/drawing/2017/model3d" xmlns:o="urn:schemas-microsoft-com:office:office" xmlns:oel="http://schemas.microsoft.com/office/2019/extlst" xmlns:r="http://schemas.openxmlformats.org/officeDocument/2006/relationships" xmlns:m="http://schemas.openxmlformats.org/officeDocument/2006/math" xmlns:v="urn:schemas-microsoft-com:vml" xmlns:wp14="http://schemas.microsoft.com/office/word/2010/wordprocessingDrawing" xmlns:wp="http://schemas.openxmlformats.org/drawingml/2006/wordprocessingDrawing" xmlns:w10="urn:schemas-microsoft-com:office:word" xmlns:w="http://schemas.openxmlformats.org/wordprocessingml/2006/main" xmlns:w14="http://schemas.microsoft.com/office/word/2010/wordml" xmlns:w15="http://schemas.microsoft.com/office/word/2012/wordml" xmlns:w16cex="http://schemas.microsoft.com/office/word/2018/wordml/cex" xmlns:w16cid="http://schemas.microsoft.com/office/word/2016/wordml/cid" xmlns:w16="http://schemas.microsoft.com/office/word/2018/wordml" xmlns:w16du="http://schemas.microsoft.com/office/word/2023/wordml/word16du" xmlns:w16sdtdh="http://schemas.microsoft.com/office/word/2020/wordml/sdtdatahash" xmlns:w16se="http://schemas.microsoft.com/office/word/2015/wordml/symex" xmlns:wpg="http://schemas.microsoft.com/office/word/2010/wordprocessingGroup" xmlns:wpi="http://schemas.microsoft.com/office/word/2010/wordprocessingInk" xmlns:wne="http://schemas.microsoft.com/office/word/2006/wordml" xmlns:wps="http://schemas.microsoft.com/office/word/2010/wordprocessingShape" mc:Ignorable="w14 w15 w16se w16cid w16 w16cex w16sdtdh w16du wp14">
+<w:document xmlns:wpc="http://schemas.microsoft.com/office/word/2010/wordprocessingCanvas" xmlns:cx="http://schemas.microsoft.com/office/drawing/2014/chartex" xmlns:cx1="http://schemas.microsoft.com/office/drawing/2015/9/8/chartex" xmlns:cx2="http://schemas.microsoft.com/office/drawing/2015/10/21/chartex" xmlns:cx3="http://schemas.microsoft.com/office/drawing/2016/5/9/chartex" xmlns:cx4="http://schemas.microsoft.com/office/drawing/2016/5/10/chartex" xmlns:cx5="http://schemas.microsoft.com/office/drawing/2016/5/11/chartex" xmlns:cx6="http://schemas.microsoft.com/office/drawing/2016/5/12/chartex" xmlns:cx7="http://schemas.microsoft.com/office/drawing/2016/5/13/chartex" xmlns:cx8="http://schemas.microsoft.com/office/drawing/2016/5/14/chartex" xmlns:mc="http://schemas.openxmlformats.org/markup-compatibility/2006" xmlns:aink="http://schemas.microsoft.com/office/drawing/2016/ink" xmlns:am3d="http://schemas.microsoft.com/office/drawing/2017/model3d" xmlns:o="urn:schemas-microsoft-com:office:office" xmlns:oel="http://schemas.microsoft.com/office/2019/extlst" xmlns:r="http://schemas.openxmlformats.org/officeDocument/2006/relationships" xmlns:m="http://schemas.openxmlformats.org/officeDocument/2006/math" xmlns:v="urn:schemas-microsoft-com:vml" xmlns:wp14="http://schemas.microsoft.com/office/word/2010/wordprocessingDrawing" xmlns:wp="http://schemas.openxmlformats.org/drawingml/2006/wordprocessingDrawing" xmlns:w10="urn:schemas-microsoft-com:office:word" xmlns:w="http://schemas.openxmlformats.org/wordprocessingml/2006/main" xmlns:w14="http://schemas.microsoft.com/office/word/2010/wordml" xmlns:w15="http://schemas.microsoft.com/office/word/2012/wordml" xmlns:w16cex="http://schemas.microsoft.com/office/word/2018/wordml/cex" xmlns:w16cid="http://schemas.microsoft.com/office/word/2016/wordml/cid" xmlns:w16="http://schemas.microsoft.com/office/word/2018/wordml" xmlns:w16du="http://schemas.microsoft.com/office/word/2023/wordml/word16du" xmlns:w16sdtdh="http://schemas.microsoft.com/office/word/2020/wordml/sdtdatahash" xmlns:w16sdtfl="http://schemas.microsoft.com/office/word/2024/wordml/sdtformatlock" xmlns:w16se="http://schemas.microsoft.com/office/word/2015/wordml/symex" xmlns:wpg="http://schemas.microsoft.com/office/word/2010/wordprocessingGroup" xmlns:wpi="http://schemas.microsoft.com/office/word/2010/wordprocessingInk" xmlns:wne="http://schemas.microsoft.com/office/word/2006/wordml" xmlns:wps="http://schemas.microsoft.com/office/word/2010/wordprocessingShape" mc:Ignorable="w14 w15 w16se w16cid w16 w16cex w16sdtdh w16sdtfl w16du wp14">
   <w:body>
     <w:p>
       <w:pPr>
@@ -11,7 +11,7 @@
           <w:noProof/>
         </w:rPr>
         <w:drawing>
-          <wp:inline distT="0" distB="0" distL="0" distR="0" wp14:anchorId="506BAB9D" wp14:editId="491C92C6">
+          <wp:inline distT="0" distB="0" distL="0" distR="0" wp14:anchorId="506BAB9D" wp14:editId="2257285E">
             <wp:extent cx="5760720" cy="2656840"/>
             <wp:effectExtent l="0" t="0" r="0" b="0"/>
             <wp:docPr id="1921310496" name="Image 1"/>
@@ -122,25 +122,7 @@
           <w:szCs w:val="28"/>
           <w:lang w:val="en-US"/>
         </w:rPr>
-        <w:t xml:space="preserve">: git add </w:t>
-      </w:r>
-      <w:proofErr w:type="gramStart"/>
-      <w:r>
-        <w:rPr>
-          <w:sz w:val="28"/>
-          <w:szCs w:val="28"/>
-          <w:lang w:val="en-US"/>
-        </w:rPr>
-        <w:t>* ;</w:t>
-      </w:r>
-      <w:proofErr w:type="gramEnd"/>
-      <w:r>
-        <w:rPr>
-          <w:sz w:val="28"/>
-          <w:szCs w:val="28"/>
-          <w:lang w:val="en-US"/>
-        </w:rPr>
-        <w:t xml:space="preserve">  git commit -am</w:t>
+        <w:t>: git add * ;  git commit -am</w:t>
       </w:r>
       <w:r>
         <w:rPr>
@@ -175,21 +157,7 @@
         <w:rPr>
           <w:lang w:val="en-US"/>
         </w:rPr>
-        <w:t>git commit -</w:t>
-      </w:r>
-      <w:proofErr w:type="spellStart"/>
-      <w:r>
-        <w:rPr>
-          <w:lang w:val="en-US"/>
-        </w:rPr>
-        <w:t>am"All</w:t>
-      </w:r>
-      <w:proofErr w:type="spellEnd"/>
-      <w:r>
-        <w:rPr>
-          <w:lang w:val="en-US"/>
-        </w:rPr>
-        <w:t xml:space="preserve"> Project add"</w:t>
+        <w:t>git commit -am"All Project add"</w:t>
       </w:r>
     </w:p>
     <w:p>
@@ -221,13 +189,8 @@
       </w:r>
     </w:p>
     <w:p>
-      <w:proofErr w:type="gramStart"/>
-      <w:r>
-        <w:t>git</w:t>
-      </w:r>
-      <w:proofErr w:type="gramEnd"/>
-      <w:r>
-        <w:t xml:space="preserve"> clone https://github.com/SouleymaMahamadene/All-My-Project.git</w:t>
+      <w:r>
+        <w:t>git clone https://github.com/SouleymaMahamadene/All-My-Project.git</w:t>
       </w:r>
     </w:p>
     <w:p>
@@ -448,37 +411,12 @@
         </w:rPr>
         <w:t xml:space="preserve"> </w:t>
       </w:r>
-      <w:proofErr w:type="spellStart"/>
       <w:r>
         <w:rPr>
           <w:sz w:val="24"/>
           <w:szCs w:val="24"/>
         </w:rPr>
-        <w:t>Projets_</w:t>
-      </w:r>
-      <w:proofErr w:type="gramStart"/>
-      <w:r>
-        <w:rPr>
-          <w:sz w:val="24"/>
-          <w:szCs w:val="24"/>
-        </w:rPr>
-        <w:t>Personnel</w:t>
-      </w:r>
-      <w:proofErr w:type="spellEnd"/>
-      <w:r>
-        <w:rPr>
-          <w:sz w:val="24"/>
-          <w:szCs w:val="24"/>
-        </w:rPr>
-        <w:t>;</w:t>
-      </w:r>
-      <w:proofErr w:type="gramEnd"/>
-      <w:r>
-        <w:rPr>
-          <w:sz w:val="24"/>
-          <w:szCs w:val="24"/>
-        </w:rPr>
-        <w:t xml:space="preserve"> tous les projet</w:t>
+        <w:t>Projets_Personnel; tous les projet</w:t>
       </w:r>
     </w:p>
     <w:p/>
@@ -540,35 +478,13 @@
       </w:r>
     </w:p>
     <w:p>
-      <w:proofErr w:type="spellStart"/>
-      <w:proofErr w:type="gramStart"/>
-      <w:r>
-        <w:t>commands</w:t>
-      </w:r>
-      <w:proofErr w:type="spellEnd"/>
-      <w:proofErr w:type="gramEnd"/>
-      <w:r>
-        <w:t xml:space="preserve"> for </w:t>
-      </w:r>
-    </w:p>
-    <w:p>
-      <w:proofErr w:type="spellStart"/>
-      <w:proofErr w:type="gramStart"/>
-      <w:r>
-        <w:t>windows</w:t>
-      </w:r>
-      <w:proofErr w:type="spellEnd"/>
-      <w:proofErr w:type="gramEnd"/>
-      <w:r>
-        <w:t xml:space="preserve"> </w:t>
-      </w:r>
-      <w:proofErr w:type="spellStart"/>
-      <w:r>
-        <w:t>users</w:t>
-      </w:r>
-      <w:proofErr w:type="spellEnd"/>
-      <w:r>
-        <w:t>:</w:t>
+      <w:r>
+        <w:t>commands for </w:t>
+      </w:r>
+    </w:p>
+    <w:p>
+      <w:r>
+        <w:t>windows users:</w:t>
       </w:r>
     </w:p>
     <w:p>
@@ -588,18 +504,8 @@
     </w:p>
     <w:p>
       <w:r>
-        <w:t xml:space="preserve">Linux, Mac </w:t>
-      </w:r>
-      <w:proofErr w:type="spellStart"/>
-      <w:proofErr w:type="gramStart"/>
-      <w:r>
-        <w:t>users</w:t>
-      </w:r>
-      <w:proofErr w:type="spellEnd"/>
-      <w:r>
-        <w:t>:</w:t>
-      </w:r>
-      <w:proofErr w:type="gramEnd"/>
+        <w:t>Linux, Mac users:</w:t>
+      </w:r>
     </w:p>
     <w:p>
       <w:hyperlink r:id="rId10" w:tgtFrame="_blank" w:tooltip="https://www.geeksforgeeks.org/linux-commands-cheat-sheet/" w:history="1">
@@ -721,72 +627,19 @@
         <w:rPr>
           <w:highlight w:val="yellow"/>
         </w:rPr>
-        <w:t xml:space="preserve">Git </w:t>
-      </w:r>
-      <w:proofErr w:type="gramStart"/>
-      <w:r>
-        <w:rPr>
-          <w:highlight w:val="yellow"/>
-        </w:rPr>
-        <w:t>hub:</w:t>
-      </w:r>
-      <w:proofErr w:type="gramEnd"/>
-      <w:r>
-        <w:rPr>
-          <w:highlight w:val="yellow"/>
-        </w:rPr>
-        <w:t xml:space="preserve"> git </w:t>
-      </w:r>
-      <w:proofErr w:type="spellStart"/>
-      <w:r>
-        <w:rPr>
-          <w:highlight w:val="yellow"/>
-        </w:rPr>
-        <w:t>add</w:t>
-      </w:r>
-      <w:proofErr w:type="spellEnd"/>
-      <w:r>
-        <w:rPr>
-          <w:highlight w:val="yellow"/>
-        </w:rPr>
-        <w:t xml:space="preserve"> * ; git commit ; que font ces codes comme tâches?</w:t>
+        <w:t>Git hub: git add * ; git commit ; que font ces codes comme tâches?</w:t>
       </w:r>
     </w:p>
     <w:p>
       <w:r>
         <w:t xml:space="preserve">Les commandes </w:t>
       </w:r>
-      <w:proofErr w:type="gramStart"/>
-      <w:r>
-        <w:rPr>
-          <w:b/>
-          <w:bCs/>
-        </w:rPr>
-        <w:t>git</w:t>
-      </w:r>
-      <w:proofErr w:type="gramEnd"/>
-      <w:r>
-        <w:rPr>
-          <w:b/>
-          <w:bCs/>
-        </w:rPr>
-        <w:t xml:space="preserve"> </w:t>
-      </w:r>
-      <w:proofErr w:type="spellStart"/>
-      <w:r>
-        <w:rPr>
-          <w:b/>
-          <w:bCs/>
-        </w:rPr>
-        <w:t>add</w:t>
-      </w:r>
-      <w:proofErr w:type="spellEnd"/>
-      <w:r>
-        <w:rPr>
-          <w:b/>
-          <w:bCs/>
-        </w:rPr>
-        <w:t xml:space="preserve"> *</w:t>
+      <w:r>
+        <w:rPr>
+          <w:b/>
+          <w:bCs/>
+        </w:rPr>
+        <w:t>git add *</w:t>
       </w:r>
       <w:r>
         <w:t xml:space="preserve"> et </w:t>
@@ -824,23 +677,7 @@
           <w:b/>
           <w:bCs/>
         </w:rPr>
-        <w:t xml:space="preserve">1. git </w:t>
-      </w:r>
-      <w:proofErr w:type="spellStart"/>
-      <w:r>
-        <w:rPr>
-          <w:b/>
-          <w:bCs/>
-        </w:rPr>
-        <w:t>add</w:t>
-      </w:r>
-      <w:proofErr w:type="spellEnd"/>
-      <w:r>
-        <w:rPr>
-          <w:b/>
-          <w:bCs/>
-        </w:rPr>
-        <w:t xml:space="preserve"> * :</w:t>
+        <w:t>1. git add * :</w:t>
       </w:r>
     </w:p>
     <w:p>
@@ -860,21 +697,12 @@
       <w:r>
         <w:t xml:space="preserve"> : Ajouter des fichiers au </w:t>
       </w:r>
-      <w:proofErr w:type="spellStart"/>
-      <w:r>
-        <w:rPr>
-          <w:b/>
-          <w:bCs/>
-        </w:rPr>
-        <w:t>staging</w:t>
-      </w:r>
-      <w:proofErr w:type="spellEnd"/>
-      <w:r>
-        <w:rPr>
-          <w:b/>
-          <w:bCs/>
-        </w:rPr>
-        <w:t xml:space="preserve"> area</w:t>
+      <w:r>
+        <w:rPr>
+          <w:b/>
+          <w:bCs/>
+        </w:rPr>
+        <w:t>staging area</w:t>
       </w:r>
       <w:r>
         <w:t xml:space="preserve"> (zone de préparation) avant de les valider dans le dépôt.</w:t>
@@ -946,23 +774,7 @@
           <w:b/>
           <w:bCs/>
         </w:rPr>
-        <w:t xml:space="preserve">git </w:t>
-      </w:r>
-      <w:proofErr w:type="spellStart"/>
-      <w:r>
-        <w:rPr>
-          <w:b/>
-          <w:bCs/>
-        </w:rPr>
-        <w:t>add</w:t>
-      </w:r>
-      <w:proofErr w:type="spellEnd"/>
-      <w:r>
-        <w:rPr>
-          <w:b/>
-          <w:bCs/>
-        </w:rPr>
-        <w:t xml:space="preserve"> *</w:t>
+        <w:t>git add *</w:t>
       </w:r>
       <w:r>
         <w:t xml:space="preserve"> va tous les ajouter à l'index de Git, afin qu'ils soient prêts à être validés.</w:t>
@@ -990,63 +802,24 @@
           <w:numId w:val="2"/>
         </w:numPr>
       </w:pPr>
-      <w:proofErr w:type="gramStart"/>
       <w:r>
         <w:rPr>
           <w:b/>
           <w:bCs/>
         </w:rPr>
         <w:lastRenderedPageBreak/>
-        <w:t>git</w:t>
-      </w:r>
-      <w:proofErr w:type="gramEnd"/>
-      <w:r>
-        <w:rPr>
-          <w:b/>
-          <w:bCs/>
-        </w:rPr>
-        <w:t xml:space="preserve"> </w:t>
-      </w:r>
-      <w:proofErr w:type="spellStart"/>
-      <w:r>
-        <w:rPr>
-          <w:b/>
-          <w:bCs/>
-        </w:rPr>
-        <w:t>add</w:t>
-      </w:r>
-      <w:proofErr w:type="spellEnd"/>
-      <w:r>
-        <w:rPr>
-          <w:b/>
-          <w:bCs/>
-        </w:rPr>
-        <w:t xml:space="preserve"> *</w:t>
-      </w:r>
-      <w:r>
-        <w:t xml:space="preserve"> peut ajouter tous les fichiers, y compris ceux que vous ne souhaitez pas, comme des fichiers générés automatiquement. Vous pouvez </w:t>
-      </w:r>
-      <w:proofErr w:type="gramStart"/>
-      <w:r>
-        <w:t xml:space="preserve">utiliser </w:t>
-      </w:r>
-      <w:r>
-        <w:rPr>
-          <w:b/>
-          <w:bCs/>
-        </w:rPr>
-        <w:t>.</w:t>
-      </w:r>
-      <w:proofErr w:type="spellStart"/>
-      <w:r>
-        <w:rPr>
-          <w:b/>
-          <w:bCs/>
-        </w:rPr>
-        <w:t>gitignore</w:t>
-      </w:r>
-      <w:proofErr w:type="spellEnd"/>
-      <w:proofErr w:type="gramEnd"/>
+        <w:t>git add *</w:t>
+      </w:r>
+      <w:r>
+        <w:t xml:space="preserve"> peut ajouter tous les fichiers, y compris ceux que vous ne souhaitez pas, comme des fichiers générés automatiquement. Vous pouvez utiliser </w:t>
+      </w:r>
+      <w:r>
+        <w:rPr>
+          <w:b/>
+          <w:bCs/>
+        </w:rPr>
+        <w:t>.gitignore</w:t>
+      </w:r>
       <w:r>
         <w:t xml:space="preserve"> pour ignorer certains fichiers.</w:t>
       </w:r>
@@ -1106,17 +879,8 @@
           <w:b/>
           <w:bCs/>
         </w:rPr>
-        <w:t xml:space="preserve">git </w:t>
-      </w:r>
-      <w:proofErr w:type="spellStart"/>
-      <w:r>
-        <w:rPr>
-          <w:b/>
-          <w:bCs/>
-        </w:rPr>
-        <w:t>add</w:t>
-      </w:r>
-      <w:proofErr w:type="spellEnd"/>
+        <w:t>git add</w:t>
+      </w:r>
       <w:r>
         <w:t xml:space="preserve">). Lors du </w:t>
       </w:r>
@@ -1176,23 +940,7 @@
           <w:b/>
           <w:bCs/>
         </w:rPr>
-        <w:t xml:space="preserve">git </w:t>
-      </w:r>
-      <w:proofErr w:type="spellStart"/>
-      <w:r>
-        <w:rPr>
-          <w:b/>
-          <w:bCs/>
-        </w:rPr>
-        <w:t>add</w:t>
-      </w:r>
-      <w:proofErr w:type="spellEnd"/>
-      <w:r>
-        <w:rPr>
-          <w:b/>
-          <w:bCs/>
-        </w:rPr>
-        <w:t xml:space="preserve"> *</w:t>
+        <w:t>git add *</w:t>
       </w:r>
       <w:r>
         <w:t xml:space="preserve">, puis vous exécutez </w:t>
@@ -1230,48 +978,15 @@
           <w:numId w:val="4"/>
         </w:numPr>
       </w:pPr>
-      <w:proofErr w:type="gramStart"/>
-      <w:r>
-        <w:rPr>
-          <w:b/>
-          <w:bCs/>
-        </w:rPr>
-        <w:t>git</w:t>
-      </w:r>
-      <w:proofErr w:type="gramEnd"/>
-      <w:r>
-        <w:rPr>
-          <w:b/>
-          <w:bCs/>
-        </w:rPr>
-        <w:t xml:space="preserve"> </w:t>
-      </w:r>
-      <w:proofErr w:type="spellStart"/>
-      <w:r>
-        <w:rPr>
-          <w:b/>
-          <w:bCs/>
-        </w:rPr>
-        <w:t>add</w:t>
-      </w:r>
-      <w:proofErr w:type="spellEnd"/>
-      <w:r>
-        <w:rPr>
-          <w:b/>
-          <w:bCs/>
-        </w:rPr>
-        <w:t xml:space="preserve"> *</w:t>
-      </w:r>
-      <w:r>
-        <w:t xml:space="preserve"> : Ajoute tous les fichiers modifiés ou nouveaux au </w:t>
-      </w:r>
-      <w:proofErr w:type="spellStart"/>
-      <w:r>
-        <w:t>staging</w:t>
-      </w:r>
-      <w:proofErr w:type="spellEnd"/>
-      <w:r>
-        <w:t xml:space="preserve"> area (zone de préparation).</w:t>
+      <w:r>
+        <w:rPr>
+          <w:b/>
+          <w:bCs/>
+        </w:rPr>
+        <w:t>git add *</w:t>
+      </w:r>
+      <w:r>
+        <w:t xml:space="preserve"> : Ajoute tous les fichiers modifiés ou nouveaux au staging area (zone de préparation).</w:t>
       </w:r>
     </w:p>
     <w:p>
@@ -1281,21 +996,12 @@
           <w:numId w:val="4"/>
         </w:numPr>
       </w:pPr>
-      <w:proofErr w:type="gramStart"/>
-      <w:r>
-        <w:rPr>
-          <w:b/>
-          <w:bCs/>
-        </w:rPr>
-        <w:t>git</w:t>
-      </w:r>
-      <w:proofErr w:type="gramEnd"/>
-      <w:r>
-        <w:rPr>
-          <w:b/>
-          <w:bCs/>
-        </w:rPr>
-        <w:t xml:space="preserve"> commit</w:t>
+      <w:r>
+        <w:rPr>
+          <w:b/>
+          <w:bCs/>
+        </w:rPr>
+        <w:t>git commit</w:t>
       </w:r>
       <w:r>
         <w:t xml:space="preserve"> : Valide ces fichiers dans l'historique de Git avec un message de commit décrivant les changements.</w:t>
@@ -1328,63 +1034,28 @@
     </w:p>
     <w:p>
       <w:r>
-        <w:t xml:space="preserve">Git </w:t>
-      </w:r>
-      <w:proofErr w:type="gramStart"/>
-      <w:r>
-        <w:t>hub:</w:t>
-      </w:r>
-      <w:proofErr w:type="gramEnd"/>
-      <w:r>
-        <w:t xml:space="preserve"> </w:t>
-      </w:r>
-      <w:proofErr w:type="spellStart"/>
-      <w:r>
-        <w:t>creer</w:t>
-      </w:r>
-      <w:proofErr w:type="spellEnd"/>
-      <w:r>
-        <w:t xml:space="preserve"> un projet sur Git hub; cloner ce projet avec son pc en local; </w:t>
-      </w:r>
-      <w:proofErr w:type="spellStart"/>
-      <w:r>
-        <w:t>montre moi</w:t>
-      </w:r>
-      <w:proofErr w:type="spellEnd"/>
-      <w:r>
-        <w:t xml:space="preserve"> facilement?</w:t>
-      </w:r>
-    </w:p>
-    <w:p>
-      <w:pPr>
-        <w:rPr>
-          <w:b/>
-          <w:bCs/>
-        </w:rPr>
-      </w:pPr>
-      <w:proofErr w:type="spellStart"/>
-      <w:r>
-        <w:rPr>
-          <w:b/>
-          <w:bCs/>
-        </w:rPr>
+        <w:t>Git hub: creer un projet sur Git hub; cloner ce projet avec son pc en local; montre moi facilement?</w:t>
+      </w:r>
+    </w:p>
+    <w:p>
+      <w:pPr>
+        <w:rPr>
+          <w:b/>
+          <w:bCs/>
+        </w:rPr>
+      </w:pPr>
+      <w:r>
+        <w:rPr>
+          <w:b/>
+          <w:bCs/>
+        </w:rPr>
+        <w:t>ChatGPT a dit :</w:t>
+      </w:r>
+    </w:p>
+    <w:p>
+      <w:r>
         <w:t>ChatGPT</w:t>
       </w:r>
-      <w:proofErr w:type="spellEnd"/>
-      <w:r>
-        <w:rPr>
-          <w:b/>
-          <w:bCs/>
-        </w:rPr>
-        <w:t xml:space="preserve"> a dit :</w:t>
-      </w:r>
-    </w:p>
-    <w:p>
-      <w:proofErr w:type="spellStart"/>
-      <w:r>
-        <w:t>ChatGPT</w:t>
-      </w:r>
-      <w:proofErr w:type="spellEnd"/>
     </w:p>
     <w:p>
       <w:r>
@@ -1568,23 +1239,7 @@
           <w:b/>
           <w:bCs/>
         </w:rPr>
-        <w:t>"</w:t>
-      </w:r>
-      <w:proofErr w:type="spellStart"/>
-      <w:r>
-        <w:rPr>
-          <w:b/>
-          <w:bCs/>
-        </w:rPr>
-        <w:t>Create</w:t>
-      </w:r>
-      <w:proofErr w:type="spellEnd"/>
-      <w:r>
-        <w:rPr>
-          <w:b/>
-          <w:bCs/>
-        </w:rPr>
-        <w:t xml:space="preserve"> repository"</w:t>
+        <w:t>"Create repository"</w:t>
       </w:r>
       <w:r>
         <w:t>.</w:t>
@@ -1687,23 +1342,7 @@
           <w:b/>
           <w:bCs/>
         </w:rPr>
-        <w:t xml:space="preserve">"Clone </w:t>
-      </w:r>
-      <w:proofErr w:type="spellStart"/>
-      <w:r>
-        <w:rPr>
-          <w:b/>
-          <w:bCs/>
-        </w:rPr>
-        <w:t>with</w:t>
-      </w:r>
-      <w:proofErr w:type="spellEnd"/>
-      <w:r>
-        <w:rPr>
-          <w:b/>
-          <w:bCs/>
-        </w:rPr>
-        <w:t xml:space="preserve"> HTTPS"</w:t>
+        <w:t>"Clone with HTTPS"</w:t>
       </w:r>
       <w:r>
         <w:t xml:space="preserve"> (elle commence par https://github.com/...).</w:t>
@@ -1766,13 +1405,9 @@
       </w:r>
     </w:p>
     <w:p>
-      <w:proofErr w:type="spellStart"/>
-      <w:proofErr w:type="gramStart"/>
       <w:r>
         <w:t>bash</w:t>
       </w:r>
-      <w:proofErr w:type="spellEnd"/>
-      <w:proofErr w:type="gramEnd"/>
     </w:p>
     <w:p>
       <w:r>
@@ -1780,13 +1415,8 @@
       </w:r>
     </w:p>
     <w:p>
-      <w:proofErr w:type="gramStart"/>
-      <w:r>
-        <w:t>git</w:t>
-      </w:r>
-      <w:proofErr w:type="gramEnd"/>
-      <w:r>
-        <w:t xml:space="preserve"> clone https://github.com/ton-nom-utilisateur/mon-projet.git</w:t>
+      <w:r>
+        <w:t>git clone https://github.com/ton-nom-utilisateur/mon-projet.git</w:t>
       </w:r>
     </w:p>
     <w:p>
@@ -1825,13 +1455,9 @@
       </w:r>
     </w:p>
     <w:p>
-      <w:proofErr w:type="spellStart"/>
-      <w:proofErr w:type="gramStart"/>
       <w:r>
         <w:t>bash</w:t>
       </w:r>
-      <w:proofErr w:type="spellEnd"/>
-      <w:proofErr w:type="gramEnd"/>
     </w:p>
     <w:p>
       <w:r>
@@ -1839,13 +1465,8 @@
       </w:r>
     </w:p>
     <w:p>
-      <w:proofErr w:type="gramStart"/>
-      <w:r>
-        <w:t>cd</w:t>
-      </w:r>
-      <w:proofErr w:type="gramEnd"/>
-      <w:r>
-        <w:t xml:space="preserve"> mon-projet</w:t>
+      <w:r>
+        <w:t>cd mon-projet</w:t>
       </w:r>
     </w:p>
     <w:p>
@@ -1920,17 +1541,8 @@
           <w:b/>
           <w:bCs/>
         </w:rPr>
-        <w:t xml:space="preserve">git </w:t>
-      </w:r>
-      <w:proofErr w:type="spellStart"/>
-      <w:r>
-        <w:rPr>
-          <w:b/>
-          <w:bCs/>
-        </w:rPr>
-        <w:t>add</w:t>
-      </w:r>
-      <w:proofErr w:type="spellEnd"/>
+        <w:t>git add</w:t>
+      </w:r>
       <w:r>
         <w:t xml:space="preserve">, </w:t>
       </w:r>
@@ -1956,64 +1568,12 @@
       </w:r>
     </w:p>
     <w:p>
-      <w:proofErr w:type="spellStart"/>
-      <w:proofErr w:type="gramStart"/>
       <w:r>
         <w:rPr>
           <w:highlight w:val="yellow"/>
         </w:rPr>
         <w:lastRenderedPageBreak/>
-        <w:t>conda</w:t>
-      </w:r>
-      <w:proofErr w:type="spellEnd"/>
-      <w:proofErr w:type="gramEnd"/>
-      <w:r>
-        <w:rPr>
-          <w:highlight w:val="yellow"/>
-        </w:rPr>
-        <w:t xml:space="preserve"> </w:t>
-      </w:r>
-      <w:proofErr w:type="spellStart"/>
-      <w:r>
-        <w:rPr>
-          <w:highlight w:val="yellow"/>
-        </w:rPr>
-        <w:t>create</w:t>
-      </w:r>
-      <w:proofErr w:type="spellEnd"/>
-      <w:r>
-        <w:rPr>
-          <w:highlight w:val="yellow"/>
-        </w:rPr>
-        <w:t xml:space="preserve"> --</w:t>
-      </w:r>
-      <w:proofErr w:type="spellStart"/>
-      <w:r>
-        <w:rPr>
-          <w:highlight w:val="yellow"/>
-        </w:rPr>
-        <w:t>name</w:t>
-      </w:r>
-      <w:proofErr w:type="spellEnd"/>
-      <w:r>
-        <w:rPr>
-          <w:highlight w:val="yellow"/>
-        </w:rPr>
-        <w:t xml:space="preserve"> </w:t>
-      </w:r>
-      <w:proofErr w:type="spellStart"/>
-      <w:r>
-        <w:rPr>
-          <w:highlight w:val="yellow"/>
-        </w:rPr>
-        <w:t>env_mlops</w:t>
-      </w:r>
-      <w:proofErr w:type="spellEnd"/>
-      <w:r>
-        <w:rPr>
-          <w:highlight w:val="yellow"/>
-        </w:rPr>
-        <w:t xml:space="preserve"> python=3.9</w:t>
+        <w:t>conda create --name env_mlops python=3.9</w:t>
       </w:r>
     </w:p>
     <w:p/>
@@ -2353,39 +1913,19 @@
       </w:r>
     </w:p>
     <w:p>
-      <w:proofErr w:type="gramStart"/>
-      <w:r>
-        <w:t>git</w:t>
-      </w:r>
-      <w:proofErr w:type="gramEnd"/>
-      <w:r>
-        <w:t xml:space="preserve"> </w:t>
-      </w:r>
-      <w:proofErr w:type="spellStart"/>
-      <w:r>
-        <w:t>add</w:t>
-      </w:r>
-      <w:proofErr w:type="spellEnd"/>
-    </w:p>
-    <w:p>
-      <w:proofErr w:type="gramStart"/>
+      <w:r>
+        <w:t>git add</w:t>
+      </w:r>
+    </w:p>
+    <w:p>
       <w:r>
         <w:lastRenderedPageBreak/>
-        <w:t>git</w:t>
-      </w:r>
-      <w:proofErr w:type="gramEnd"/>
-      <w:r>
-        <w:t xml:space="preserve"> commit m</w:t>
-      </w:r>
-    </w:p>
-    <w:p>
-      <w:proofErr w:type="gramStart"/>
-      <w:r>
-        <w:t>git</w:t>
-      </w:r>
-      <w:proofErr w:type="gramEnd"/>
-      <w:r>
-        <w:t xml:space="preserve"> push</w:t>
+        <w:t>git commit m</w:t>
+      </w:r>
+    </w:p>
+    <w:p>
+      <w:r>
+        <w:t>git push</w:t>
       </w:r>
     </w:p>
     <w:p>
@@ -2428,35 +1968,7 @@
         <w:rPr>
           <w:highlight w:val="yellow"/>
         </w:rPr>
-        <w:t xml:space="preserve">Les codes de Git </w:t>
-      </w:r>
-      <w:proofErr w:type="gramStart"/>
-      <w:r>
-        <w:rPr>
-          <w:highlight w:val="yellow"/>
-        </w:rPr>
-        <w:t>hub:</w:t>
-      </w:r>
-      <w:proofErr w:type="gramEnd"/>
-      <w:r>
-        <w:rPr>
-          <w:highlight w:val="yellow"/>
-        </w:rPr>
-        <w:t xml:space="preserve"> commande qui permet de </w:t>
-      </w:r>
-      <w:proofErr w:type="spellStart"/>
-      <w:r>
-        <w:rPr>
-          <w:highlight w:val="yellow"/>
-        </w:rPr>
-        <w:t>creer</w:t>
-      </w:r>
-      <w:proofErr w:type="spellEnd"/>
-      <w:r>
-        <w:rPr>
-          <w:highlight w:val="yellow"/>
-        </w:rPr>
-        <w:t xml:space="preserve"> une branche? commande qui permet de supprimer une branche? tu peux me fournir les commandes qui sont importants pour git hub?</w:t>
+        <w:t>Les codes de Git hub: commande qui permet de creer une branche? commande qui permet de supprimer une branche? tu peux me fournir les commandes qui sont importants pour git hub?</w:t>
       </w:r>
     </w:p>
     <w:p>
@@ -2516,13 +2028,9 @@
       </w:r>
     </w:p>
     <w:p>
-      <w:proofErr w:type="spellStart"/>
-      <w:proofErr w:type="gramStart"/>
       <w:r>
         <w:t>bash</w:t>
       </w:r>
-      <w:proofErr w:type="spellEnd"/>
-      <w:proofErr w:type="gramEnd"/>
     </w:p>
     <w:p>
       <w:r>
@@ -2530,21 +2038,8 @@
       </w:r>
     </w:p>
     <w:p>
-      <w:proofErr w:type="gramStart"/>
-      <w:r>
-        <w:t>git</w:t>
-      </w:r>
-      <w:proofErr w:type="gramEnd"/>
-      <w:r>
-        <w:t xml:space="preserve"> </w:t>
-      </w:r>
-      <w:proofErr w:type="spellStart"/>
-      <w:r>
-        <w:t>branch</w:t>
-      </w:r>
-      <w:proofErr w:type="spellEnd"/>
-      <w:r>
-        <w:t xml:space="preserve"> &lt;nom-de-la-branche&gt;</w:t>
+      <w:r>
+        <w:t>git branch &lt;nom-de-la-branche&gt;</w:t>
       </w:r>
     </w:p>
     <w:p>
@@ -2555,31 +2050,7 @@
         </w:numPr>
       </w:pPr>
       <w:r>
-        <w:t xml:space="preserve">Exemple : git </w:t>
-      </w:r>
-      <w:proofErr w:type="spellStart"/>
-      <w:r>
-        <w:t>branch</w:t>
-      </w:r>
-      <w:proofErr w:type="spellEnd"/>
-      <w:r>
-        <w:t xml:space="preserve"> </w:t>
-      </w:r>
-      <w:proofErr w:type="spellStart"/>
-      <w:r>
-        <w:t>feature</w:t>
-      </w:r>
-      <w:proofErr w:type="spellEnd"/>
-      <w:r>
-        <w:t>-x (crée une branche appelée "</w:t>
-      </w:r>
-      <w:proofErr w:type="spellStart"/>
-      <w:r>
-        <w:t>feature</w:t>
-      </w:r>
-      <w:proofErr w:type="spellEnd"/>
-      <w:r>
-        <w:t>-x").</w:t>
+        <w:t>Exemple : git branch feature-x (crée une branche appelée "feature-x").</w:t>
       </w:r>
     </w:p>
     <w:p>
@@ -2602,13 +2073,9 @@
       </w:r>
     </w:p>
     <w:p>
-      <w:proofErr w:type="spellStart"/>
-      <w:proofErr w:type="gramStart"/>
       <w:r>
         <w:t>bash</w:t>
       </w:r>
-      <w:proofErr w:type="spellEnd"/>
-      <w:proofErr w:type="gramEnd"/>
     </w:p>
     <w:p>
       <w:r>
@@ -2616,21 +2083,8 @@
       </w:r>
     </w:p>
     <w:p>
-      <w:proofErr w:type="gramStart"/>
-      <w:r>
-        <w:t>git</w:t>
-      </w:r>
-      <w:proofErr w:type="gramEnd"/>
-      <w:r>
-        <w:t xml:space="preserve"> </w:t>
-      </w:r>
-      <w:proofErr w:type="spellStart"/>
-      <w:r>
-        <w:t>branch</w:t>
-      </w:r>
-      <w:proofErr w:type="spellEnd"/>
-      <w:r>
-        <w:t xml:space="preserve"> -d &lt;nom-de-la-branche&gt;</w:t>
+      <w:r>
+        <w:t>git branch -d &lt;nom-de-la-branche&gt;</w:t>
       </w:r>
     </w:p>
     <w:p>
@@ -2641,31 +2095,7 @@
         </w:numPr>
       </w:pPr>
       <w:r>
-        <w:t xml:space="preserve">Exemple : git </w:t>
-      </w:r>
-      <w:proofErr w:type="spellStart"/>
-      <w:r>
-        <w:t>branch</w:t>
-      </w:r>
-      <w:proofErr w:type="spellEnd"/>
-      <w:r>
-        <w:t xml:space="preserve"> -d </w:t>
-      </w:r>
-      <w:proofErr w:type="spellStart"/>
-      <w:r>
-        <w:t>feature</w:t>
-      </w:r>
-      <w:proofErr w:type="spellEnd"/>
-      <w:r>
-        <w:t>-x (supprime la branche "</w:t>
-      </w:r>
-      <w:proofErr w:type="spellStart"/>
-      <w:r>
-        <w:t>feature</w:t>
-      </w:r>
-      <w:proofErr w:type="spellEnd"/>
-      <w:r>
-        <w:t>-x").</w:t>
+        <w:t>Exemple : git branch -d feature-x (supprime la branche "feature-x").</w:t>
       </w:r>
     </w:p>
     <w:p>
@@ -2680,13 +2110,9 @@
       </w:r>
     </w:p>
     <w:p>
-      <w:proofErr w:type="spellStart"/>
-      <w:proofErr w:type="gramStart"/>
       <w:r>
         <w:t>bash</w:t>
       </w:r>
-      <w:proofErr w:type="spellEnd"/>
-      <w:proofErr w:type="gramEnd"/>
     </w:p>
     <w:p>
       <w:r>
@@ -2694,21 +2120,8 @@
       </w:r>
     </w:p>
     <w:p>
-      <w:proofErr w:type="gramStart"/>
-      <w:r>
-        <w:t>git</w:t>
-      </w:r>
-      <w:proofErr w:type="gramEnd"/>
-      <w:r>
-        <w:t xml:space="preserve"> </w:t>
-      </w:r>
-      <w:proofErr w:type="spellStart"/>
-      <w:r>
-        <w:t>branch</w:t>
-      </w:r>
-      <w:proofErr w:type="spellEnd"/>
-      <w:r>
-        <w:t xml:space="preserve"> -D &lt;nom-de-la-branche&gt;</w:t>
+      <w:r>
+        <w:t>git branch -D &lt;nom-de-la-branche&gt;</w:t>
       </w:r>
     </w:p>
     <w:p>
@@ -2731,13 +2144,9 @@
       </w:r>
     </w:p>
     <w:p>
-      <w:proofErr w:type="spellStart"/>
-      <w:proofErr w:type="gramStart"/>
       <w:r>
         <w:t>bash</w:t>
       </w:r>
-      <w:proofErr w:type="spellEnd"/>
-      <w:proofErr w:type="gramEnd"/>
     </w:p>
     <w:p>
       <w:r>
@@ -2745,21 +2154,8 @@
       </w:r>
     </w:p>
     <w:p>
-      <w:proofErr w:type="gramStart"/>
-      <w:r>
-        <w:t>git</w:t>
-      </w:r>
-      <w:proofErr w:type="gramEnd"/>
-      <w:r>
-        <w:t xml:space="preserve"> </w:t>
-      </w:r>
-      <w:proofErr w:type="spellStart"/>
-      <w:r>
-        <w:t>checkout</w:t>
-      </w:r>
-      <w:proofErr w:type="spellEnd"/>
-      <w:r>
-        <w:t xml:space="preserve"> -b &lt;nom-de-la-branche&gt;</w:t>
+      <w:r>
+        <w:t>git checkout -b &lt;nom-de-la-branche&gt;</w:t>
       </w:r>
     </w:p>
     <w:p>
@@ -2770,31 +2166,7 @@
         </w:numPr>
       </w:pPr>
       <w:r>
-        <w:t xml:space="preserve">Exemple : git </w:t>
-      </w:r>
-      <w:proofErr w:type="spellStart"/>
-      <w:r>
-        <w:t>checkout</w:t>
-      </w:r>
-      <w:proofErr w:type="spellEnd"/>
-      <w:r>
-        <w:t xml:space="preserve"> -b </w:t>
-      </w:r>
-      <w:proofErr w:type="spellStart"/>
-      <w:r>
-        <w:t>feature</w:t>
-      </w:r>
-      <w:proofErr w:type="spellEnd"/>
-      <w:r>
-        <w:t>-x (crée "</w:t>
-      </w:r>
-      <w:proofErr w:type="spellStart"/>
-      <w:r>
-        <w:t>feature</w:t>
-      </w:r>
-      <w:proofErr w:type="spellEnd"/>
-      <w:r>
-        <w:t>-x" et passe dessus).</w:t>
+        <w:t>Exemple : git checkout -b feature-x (crée "feature-x" et passe dessus).</w:t>
       </w:r>
     </w:p>
     <w:p>
@@ -2817,13 +2189,9 @@
       </w:r>
     </w:p>
     <w:p>
-      <w:proofErr w:type="spellStart"/>
-      <w:proofErr w:type="gramStart"/>
       <w:r>
         <w:t>bash</w:t>
       </w:r>
-      <w:proofErr w:type="spellEnd"/>
-      <w:proofErr w:type="gramEnd"/>
     </w:p>
     <w:p>
       <w:r>
@@ -2831,21 +2199,8 @@
       </w:r>
     </w:p>
     <w:p>
-      <w:proofErr w:type="gramStart"/>
-      <w:r>
-        <w:t>git</w:t>
-      </w:r>
-      <w:proofErr w:type="gramEnd"/>
-      <w:r>
-        <w:t xml:space="preserve"> </w:t>
-      </w:r>
-      <w:proofErr w:type="spellStart"/>
-      <w:r>
-        <w:t>checkout</w:t>
-      </w:r>
-      <w:proofErr w:type="spellEnd"/>
-      <w:r>
-        <w:t xml:space="preserve"> &lt;nom-de-la-branche&gt;</w:t>
+      <w:r>
+        <w:t>git checkout &lt;nom-de-la-branche&gt;</w:t>
       </w:r>
     </w:p>
     <w:p>
@@ -2857,15 +2212,7 @@
       </w:pPr>
       <w:r>
         <w:lastRenderedPageBreak/>
-        <w:t xml:space="preserve">Exemple : git </w:t>
-      </w:r>
-      <w:proofErr w:type="spellStart"/>
-      <w:r>
-        <w:t>checkout</w:t>
-      </w:r>
-      <w:proofErr w:type="spellEnd"/>
-      <w:r>
-        <w:t xml:space="preserve"> main (passe sur la branche "main").</w:t>
+        <w:t>Exemple : git checkout main (passe sur la branche "main").</w:t>
       </w:r>
     </w:p>
     <w:p>
@@ -2888,13 +2235,9 @@
       </w:r>
     </w:p>
     <w:p>
-      <w:proofErr w:type="spellStart"/>
-      <w:proofErr w:type="gramStart"/>
       <w:r>
         <w:t>bash</w:t>
       </w:r>
-      <w:proofErr w:type="spellEnd"/>
-      <w:proofErr w:type="gramEnd"/>
     </w:p>
     <w:p>
       <w:r>
@@ -2902,19 +2245,9 @@
       </w:r>
     </w:p>
     <w:p>
-      <w:proofErr w:type="gramStart"/>
-      <w:r>
-        <w:t>git</w:t>
-      </w:r>
-      <w:proofErr w:type="gramEnd"/>
-      <w:r>
-        <w:t xml:space="preserve"> </w:t>
-      </w:r>
-      <w:proofErr w:type="spellStart"/>
-      <w:r>
-        <w:t>branch</w:t>
-      </w:r>
-      <w:proofErr w:type="spellEnd"/>
+      <w:r>
+        <w:t>git branch</w:t>
+      </w:r>
     </w:p>
     <w:p>
       <w:pPr>
@@ -2928,13 +2261,9 @@
       </w:r>
     </w:p>
     <w:p>
-      <w:proofErr w:type="spellStart"/>
-      <w:proofErr w:type="gramStart"/>
       <w:r>
         <w:t>bash</w:t>
       </w:r>
-      <w:proofErr w:type="spellEnd"/>
-      <w:proofErr w:type="gramEnd"/>
     </w:p>
     <w:p>
       <w:r>
@@ -2942,21 +2271,8 @@
       </w:r>
     </w:p>
     <w:p>
-      <w:proofErr w:type="gramStart"/>
-      <w:r>
-        <w:t>git</w:t>
-      </w:r>
-      <w:proofErr w:type="gramEnd"/>
-      <w:r>
-        <w:t xml:space="preserve"> </w:t>
-      </w:r>
-      <w:proofErr w:type="spellStart"/>
-      <w:r>
-        <w:t>branch</w:t>
-      </w:r>
-      <w:proofErr w:type="spellEnd"/>
-      <w:r>
-        <w:t xml:space="preserve"> -a</w:t>
+      <w:r>
+        <w:t>git branch -a</w:t>
       </w:r>
     </w:p>
     <w:p>
@@ -2979,13 +2295,9 @@
       </w:r>
     </w:p>
     <w:p>
-      <w:proofErr w:type="spellStart"/>
-      <w:proofErr w:type="gramStart"/>
       <w:r>
         <w:t>bash</w:t>
       </w:r>
-      <w:proofErr w:type="spellEnd"/>
-      <w:proofErr w:type="gramEnd"/>
     </w:p>
     <w:p>
       <w:r>
@@ -2993,21 +2305,8 @@
       </w:r>
     </w:p>
     <w:p>
-      <w:proofErr w:type="gramStart"/>
-      <w:r>
-        <w:t>git</w:t>
-      </w:r>
-      <w:proofErr w:type="gramEnd"/>
-      <w:r>
-        <w:t xml:space="preserve"> push </w:t>
-      </w:r>
-      <w:proofErr w:type="spellStart"/>
-      <w:r>
-        <w:t>origin</w:t>
-      </w:r>
-      <w:proofErr w:type="spellEnd"/>
-      <w:r>
-        <w:t xml:space="preserve"> --delete &lt;nom-de-la-branche&gt;</w:t>
+      <w:r>
+        <w:t>git push origin --delete &lt;nom-de-la-branche&gt;</w:t>
       </w:r>
     </w:p>
     <w:p>
@@ -3018,23 +2317,7 @@
         </w:numPr>
       </w:pPr>
       <w:r>
-        <w:t xml:space="preserve">Exemple : git push </w:t>
-      </w:r>
-      <w:proofErr w:type="spellStart"/>
-      <w:r>
-        <w:t>origin</w:t>
-      </w:r>
-      <w:proofErr w:type="spellEnd"/>
-      <w:r>
-        <w:t xml:space="preserve"> --delete </w:t>
-      </w:r>
-      <w:proofErr w:type="spellStart"/>
-      <w:r>
-        <w:t>feature</w:t>
-      </w:r>
-      <w:proofErr w:type="spellEnd"/>
-      <w:r>
-        <w:t>-x.</w:t>
+        <w:t>Exemple : git push origin --delete feature-x.</w:t>
       </w:r>
     </w:p>
     <w:p>
@@ -3076,13 +2359,9 @@
       </w:r>
     </w:p>
     <w:p>
-      <w:proofErr w:type="spellStart"/>
-      <w:proofErr w:type="gramStart"/>
       <w:r>
         <w:t>bash</w:t>
       </w:r>
-      <w:proofErr w:type="spellEnd"/>
-      <w:proofErr w:type="gramEnd"/>
     </w:p>
     <w:p>
       <w:r>
@@ -3090,13 +2369,8 @@
       </w:r>
     </w:p>
     <w:p>
-      <w:proofErr w:type="gramStart"/>
-      <w:r>
-        <w:t>git</w:t>
-      </w:r>
-      <w:proofErr w:type="gramEnd"/>
-      <w:r>
-        <w:t xml:space="preserve"> clone &lt;URL-du-dépôt&gt;</w:t>
+      <w:r>
+        <w:t>git clone &lt;URL-du-dépôt&gt;</w:t>
       </w:r>
     </w:p>
     <w:p>
@@ -3130,13 +2404,9 @@
       </w:r>
     </w:p>
     <w:p>
-      <w:proofErr w:type="spellStart"/>
-      <w:proofErr w:type="gramStart"/>
       <w:r>
         <w:t>bash</w:t>
       </w:r>
-      <w:proofErr w:type="spellEnd"/>
-      <w:proofErr w:type="gramEnd"/>
     </w:p>
     <w:p>
       <w:r>
@@ -3144,21 +2414,8 @@
       </w:r>
     </w:p>
     <w:p>
-      <w:proofErr w:type="gramStart"/>
-      <w:r>
-        <w:t>git</w:t>
-      </w:r>
-      <w:proofErr w:type="gramEnd"/>
-      <w:r>
-        <w:t xml:space="preserve"> </w:t>
-      </w:r>
-      <w:proofErr w:type="spellStart"/>
-      <w:r>
-        <w:t>add</w:t>
-      </w:r>
-      <w:proofErr w:type="spellEnd"/>
-      <w:r>
-        <w:t xml:space="preserve"> &lt;fichier-ou-dossier&gt;</w:t>
+      <w:r>
+        <w:t>git add &lt;fichier-ou-dossier&gt;</w:t>
       </w:r>
     </w:p>
     <w:p>
@@ -3169,18 +2426,8 @@
         </w:numPr>
       </w:pPr>
       <w:r>
-        <w:t xml:space="preserve">Pour tout ajouter : git </w:t>
-      </w:r>
-      <w:proofErr w:type="spellStart"/>
-      <w:proofErr w:type="gramStart"/>
-      <w:r>
-        <w:t>add</w:t>
-      </w:r>
-      <w:proofErr w:type="spellEnd"/>
-      <w:r>
-        <w:t xml:space="preserve"> .</w:t>
-      </w:r>
-      <w:proofErr w:type="gramEnd"/>
+        <w:t>Pour tout ajouter : git add .</w:t>
+      </w:r>
     </w:p>
     <w:p>
       <w:pPr>
@@ -3202,13 +2449,9 @@
       </w:r>
     </w:p>
     <w:p>
-      <w:proofErr w:type="spellStart"/>
-      <w:proofErr w:type="gramStart"/>
       <w:r>
         <w:t>bash</w:t>
       </w:r>
-      <w:proofErr w:type="spellEnd"/>
-      <w:proofErr w:type="gramEnd"/>
     </w:p>
     <w:p>
       <w:r>
@@ -3216,13 +2459,8 @@
       </w:r>
     </w:p>
     <w:p>
-      <w:proofErr w:type="gramStart"/>
-      <w:r>
-        <w:t>git</w:t>
-      </w:r>
-      <w:proofErr w:type="gramEnd"/>
-      <w:r>
-        <w:t xml:space="preserve"> commit -m "Votre message de commit"</w:t>
+      <w:r>
+        <w:t>git commit -m "Votre message de commit"</w:t>
       </w:r>
     </w:p>
     <w:p>
@@ -3245,14 +2483,10 @@
       </w:r>
     </w:p>
     <w:p>
-      <w:proofErr w:type="spellStart"/>
-      <w:proofErr w:type="gramStart"/>
       <w:r>
         <w:lastRenderedPageBreak/>
         <w:t>bash</w:t>
       </w:r>
-      <w:proofErr w:type="spellEnd"/>
-      <w:proofErr w:type="gramEnd"/>
     </w:p>
     <w:p>
       <w:r>
@@ -3260,21 +2494,8 @@
       </w:r>
     </w:p>
     <w:p>
-      <w:proofErr w:type="gramStart"/>
-      <w:r>
-        <w:t>git</w:t>
-      </w:r>
-      <w:proofErr w:type="gramEnd"/>
-      <w:r>
-        <w:t xml:space="preserve"> push </w:t>
-      </w:r>
-      <w:proofErr w:type="spellStart"/>
-      <w:r>
-        <w:t>origin</w:t>
-      </w:r>
-      <w:proofErr w:type="spellEnd"/>
-      <w:r>
-        <w:t xml:space="preserve"> &lt;nom-de-la-branche&gt;</w:t>
+      <w:r>
+        <w:t>git push origin &lt;nom-de-la-branche&gt;</w:t>
       </w:r>
     </w:p>
     <w:p>
@@ -3285,15 +2506,7 @@
         </w:numPr>
       </w:pPr>
       <w:r>
-        <w:t xml:space="preserve">Exemple : git push </w:t>
-      </w:r>
-      <w:proofErr w:type="spellStart"/>
-      <w:r>
-        <w:t>origin</w:t>
-      </w:r>
-      <w:proofErr w:type="spellEnd"/>
-      <w:r>
-        <w:t xml:space="preserve"> main.</w:t>
+        <w:t>Exemple : git push origin main.</w:t>
       </w:r>
     </w:p>
     <w:p>
@@ -3313,13 +2526,9 @@
       </w:r>
     </w:p>
     <w:p>
-      <w:proofErr w:type="spellStart"/>
-      <w:proofErr w:type="gramStart"/>
       <w:r>
         <w:t>bash</w:t>
       </w:r>
-      <w:proofErr w:type="spellEnd"/>
-      <w:proofErr w:type="gramEnd"/>
     </w:p>
     <w:p>
       <w:r>
@@ -3327,13 +2536,8 @@
       </w:r>
     </w:p>
     <w:p>
-      <w:proofErr w:type="gramStart"/>
-      <w:r>
-        <w:t>git</w:t>
-      </w:r>
-      <w:proofErr w:type="gramEnd"/>
-      <w:r>
-        <w:t xml:space="preserve"> pull</w:t>
+      <w:r>
+        <w:t>git pull</w:t>
       </w:r>
     </w:p>
     <w:p>
@@ -3356,13 +2560,9 @@
       </w:r>
     </w:p>
     <w:p>
-      <w:proofErr w:type="spellStart"/>
-      <w:proofErr w:type="gramStart"/>
       <w:r>
         <w:t>bash</w:t>
       </w:r>
-      <w:proofErr w:type="spellEnd"/>
-      <w:proofErr w:type="gramEnd"/>
     </w:p>
     <w:p>
       <w:r>
@@ -3370,13 +2570,8 @@
       </w:r>
     </w:p>
     <w:p>
-      <w:proofErr w:type="gramStart"/>
-      <w:r>
-        <w:t>git</w:t>
-      </w:r>
-      <w:proofErr w:type="gramEnd"/>
-      <w:r>
-        <w:t xml:space="preserve"> init</w:t>
+      <w:r>
+        <w:t>git init</w:t>
       </w:r>
     </w:p>
     <w:p>
@@ -3399,13 +2594,9 @@
       </w:r>
     </w:p>
     <w:p>
-      <w:proofErr w:type="spellStart"/>
-      <w:proofErr w:type="gramStart"/>
       <w:r>
         <w:t>bash</w:t>
       </w:r>
-      <w:proofErr w:type="spellEnd"/>
-      <w:proofErr w:type="gramEnd"/>
     </w:p>
     <w:p>
       <w:r>
@@ -3413,19 +2604,9 @@
       </w:r>
     </w:p>
     <w:p>
-      <w:proofErr w:type="gramStart"/>
-      <w:r>
-        <w:t>git</w:t>
-      </w:r>
-      <w:proofErr w:type="gramEnd"/>
-      <w:r>
-        <w:t xml:space="preserve"> </w:t>
-      </w:r>
-      <w:proofErr w:type="spellStart"/>
-      <w:r>
-        <w:t>status</w:t>
-      </w:r>
-      <w:proofErr w:type="spellEnd"/>
+      <w:r>
+        <w:t>git status</w:t>
+      </w:r>
     </w:p>
     <w:p>
       <w:pPr>
@@ -3443,35 +2624,13 @@
           <w:bCs/>
           <w:highlight w:val="cyan"/>
         </w:rPr>
-        <w:t xml:space="preserve">Voir l’historique des </w:t>
-      </w:r>
-      <w:proofErr w:type="spellStart"/>
-      <w:r>
-        <w:rPr>
-          <w:b/>
-          <w:bCs/>
-          <w:highlight w:val="cyan"/>
-        </w:rPr>
-        <w:t>commits</w:t>
-      </w:r>
-      <w:proofErr w:type="spellEnd"/>
-      <w:r>
-        <w:rPr>
-          <w:b/>
-          <w:bCs/>
-          <w:highlight w:val="cyan"/>
-        </w:rPr>
-        <w:t xml:space="preserve"> :</w:t>
-      </w:r>
-    </w:p>
-    <w:p>
-      <w:proofErr w:type="spellStart"/>
-      <w:proofErr w:type="gramStart"/>
+        <w:t>Voir l’historique des commits :</w:t>
+      </w:r>
+    </w:p>
+    <w:p>
       <w:r>
         <w:t>bash</w:t>
       </w:r>
-      <w:proofErr w:type="spellEnd"/>
-      <w:proofErr w:type="gramEnd"/>
     </w:p>
     <w:p>
       <w:r>
@@ -3479,13 +2638,8 @@
       </w:r>
     </w:p>
     <w:p>
-      <w:proofErr w:type="gramStart"/>
-      <w:r>
-        <w:t>git</w:t>
-      </w:r>
-      <w:proofErr w:type="gramEnd"/>
-      <w:r>
-        <w:t xml:space="preserve"> log</w:t>
+      <w:r>
+        <w:t>git log</w:t>
       </w:r>
     </w:p>
     <w:p>
@@ -3496,13 +2650,8 @@
         </w:numPr>
       </w:pPr>
       <w:r>
-        <w:t>Pour un affichage simplifié : git log --</w:t>
-      </w:r>
-      <w:proofErr w:type="spellStart"/>
-      <w:r>
-        <w:t>oneline</w:t>
-      </w:r>
-      <w:proofErr w:type="spellEnd"/>
+        <w:t>Pour un affichage simplifié : git log --oneline</w:t>
+      </w:r>
     </w:p>
     <w:p>
       <w:r>
@@ -3542,13 +2691,9 @@
       </w:r>
     </w:p>
     <w:p>
-      <w:proofErr w:type="spellStart"/>
-      <w:proofErr w:type="gramStart"/>
       <w:r>
         <w:t>bash</w:t>
       </w:r>
-      <w:proofErr w:type="spellEnd"/>
-      <w:proofErr w:type="gramEnd"/>
     </w:p>
     <w:p>
       <w:r>
@@ -3556,13 +2701,8 @@
       </w:r>
     </w:p>
     <w:p>
-      <w:proofErr w:type="gramStart"/>
-      <w:r>
-        <w:t>git</w:t>
-      </w:r>
-      <w:proofErr w:type="gramEnd"/>
-      <w:r>
-        <w:t xml:space="preserve"> merge &lt;nom-de-la-branche&gt;</w:t>
+      <w:r>
+        <w:t>git merge &lt;nom-de-la-branche&gt;</w:t>
       </w:r>
     </w:p>
     <w:p>
@@ -3573,15 +2713,7 @@
         </w:numPr>
       </w:pPr>
       <w:r>
-        <w:t xml:space="preserve">Exemple : git merge </w:t>
-      </w:r>
-      <w:proofErr w:type="spellStart"/>
-      <w:r>
-        <w:t>feature</w:t>
-      </w:r>
-      <w:proofErr w:type="spellEnd"/>
-      <w:r>
-        <w:t>-x.</w:t>
+        <w:t>Exemple : git merge feature-x.</w:t>
       </w:r>
     </w:p>
     <w:p>
@@ -3596,33 +2728,13 @@
           <w:b/>
           <w:bCs/>
         </w:rPr>
-        <w:t>Créer un lien avec un dépôt distant (remplacer "</w:t>
-      </w:r>
-      <w:proofErr w:type="spellStart"/>
-      <w:r>
-        <w:rPr>
-          <w:b/>
-          <w:bCs/>
-        </w:rPr>
-        <w:t>origin</w:t>
-      </w:r>
-      <w:proofErr w:type="spellEnd"/>
-      <w:r>
-        <w:rPr>
-          <w:b/>
-          <w:bCs/>
-        </w:rPr>
-        <w:t>" si nécessaire) :</w:t>
-      </w:r>
-    </w:p>
-    <w:p>
-      <w:proofErr w:type="spellStart"/>
-      <w:proofErr w:type="gramStart"/>
+        <w:t>Créer un lien avec un dépôt distant (remplacer "origin" si nécessaire) :</w:t>
+      </w:r>
+    </w:p>
+    <w:p>
       <w:r>
         <w:t>bash</w:t>
       </w:r>
-      <w:proofErr w:type="spellEnd"/>
-      <w:proofErr w:type="gramEnd"/>
     </w:p>
     <w:p>
       <w:r>
@@ -3630,38 +2742,9 @@
       </w:r>
     </w:p>
     <w:p>
-      <w:proofErr w:type="gramStart"/>
       <w:r>
         <w:lastRenderedPageBreak/>
-        <w:t>git</w:t>
-      </w:r>
-      <w:proofErr w:type="gramEnd"/>
-      <w:r>
-        <w:t xml:space="preserve"> </w:t>
-      </w:r>
-      <w:proofErr w:type="spellStart"/>
-      <w:r>
-        <w:t>remote</w:t>
-      </w:r>
-      <w:proofErr w:type="spellEnd"/>
-      <w:r>
-        <w:t xml:space="preserve"> </w:t>
-      </w:r>
-      <w:proofErr w:type="spellStart"/>
-      <w:r>
-        <w:t>add</w:t>
-      </w:r>
-      <w:proofErr w:type="spellEnd"/>
-      <w:r>
-        <w:t xml:space="preserve"> </w:t>
-      </w:r>
-      <w:proofErr w:type="spellStart"/>
-      <w:r>
-        <w:t>origin</w:t>
-      </w:r>
-      <w:proofErr w:type="spellEnd"/>
-      <w:r>
-        <w:t xml:space="preserve"> &lt;URL-du-dépôt&gt;</w:t>
+        <w:t>git remote add origin &lt;URL-du-dépôt&gt;</w:t>
       </w:r>
     </w:p>
     <w:p>
@@ -3691,13 +2774,9 @@
       </w:r>
     </w:p>
     <w:p>
-      <w:proofErr w:type="spellStart"/>
-      <w:proofErr w:type="gramStart"/>
       <w:r>
         <w:t>bash</w:t>
       </w:r>
-      <w:proofErr w:type="spellEnd"/>
-      <w:proofErr w:type="gramEnd"/>
     </w:p>
     <w:p>
       <w:r>
@@ -3705,31 +2784,13 @@
       </w:r>
     </w:p>
     <w:p>
-      <w:proofErr w:type="gramStart"/>
-      <w:r>
-        <w:t>git</w:t>
-      </w:r>
-      <w:proofErr w:type="gramEnd"/>
-      <w:r>
-        <w:t xml:space="preserve"> </w:t>
-      </w:r>
-      <w:proofErr w:type="spellStart"/>
-      <w:r>
-        <w:t>add</w:t>
-      </w:r>
-      <w:proofErr w:type="spellEnd"/>
-      <w:r>
-        <w:t xml:space="preserve"> &lt;fichiers-résolus&gt;</w:t>
-      </w:r>
-    </w:p>
-    <w:p>
-      <w:proofErr w:type="gramStart"/>
-      <w:r>
-        <w:t>git</w:t>
-      </w:r>
-      <w:proofErr w:type="gramEnd"/>
-      <w:r>
-        <w:t xml:space="preserve"> commit</w:t>
+      <w:r>
+        <w:t>git add &lt;fichiers-résolus&gt;</w:t>
+      </w:r>
+    </w:p>
+    <w:p>
+      <w:r>
+        <w:t>git commit</w:t>
       </w:r>
     </w:p>
     <w:p>
@@ -3759,13 +2820,9 @@
       </w:r>
     </w:p>
     <w:p>
-      <w:proofErr w:type="spellStart"/>
-      <w:proofErr w:type="gramStart"/>
       <w:r>
         <w:t>bash</w:t>
       </w:r>
-      <w:proofErr w:type="spellEnd"/>
-      <w:proofErr w:type="gramEnd"/>
     </w:p>
     <w:p>
       <w:r>
@@ -3773,21 +2830,8 @@
       </w:r>
     </w:p>
     <w:p>
-      <w:proofErr w:type="gramStart"/>
-      <w:r>
-        <w:t>git</w:t>
-      </w:r>
-      <w:proofErr w:type="gramEnd"/>
-      <w:r>
-        <w:t xml:space="preserve"> </w:t>
-      </w:r>
-      <w:proofErr w:type="spellStart"/>
-      <w:r>
-        <w:t>checkout</w:t>
-      </w:r>
-      <w:proofErr w:type="spellEnd"/>
-      <w:r>
-        <w:t xml:space="preserve"> &lt;nom-du-fichier&gt;</w:t>
+      <w:r>
+        <w:t>git checkout &lt;nom-du-fichier&gt;</w:t>
       </w:r>
     </w:p>
     <w:p>
@@ -3802,13 +2846,9 @@
       </w:r>
     </w:p>
     <w:p>
-      <w:proofErr w:type="spellStart"/>
-      <w:proofErr w:type="gramStart"/>
       <w:r>
         <w:t>bash</w:t>
       </w:r>
-      <w:proofErr w:type="spellEnd"/>
-      <w:proofErr w:type="gramEnd"/>
     </w:p>
     <w:p>
       <w:r>
@@ -3816,13 +2856,8 @@
       </w:r>
     </w:p>
     <w:p>
-      <w:proofErr w:type="gramStart"/>
-      <w:r>
-        <w:t>git</w:t>
-      </w:r>
-      <w:proofErr w:type="gramEnd"/>
-      <w:r>
-        <w:t xml:space="preserve"> reset --hard</w:t>
+      <w:r>
+        <w:t>git reset --hard</w:t>
       </w:r>
     </w:p>
     <w:p>
@@ -3841,13 +2876,9 @@
       </w:r>
     </w:p>
     <w:p>
-      <w:proofErr w:type="spellStart"/>
-      <w:proofErr w:type="gramStart"/>
       <w:r>
         <w:t>bash</w:t>
       </w:r>
-      <w:proofErr w:type="spellEnd"/>
-      <w:proofErr w:type="gramEnd"/>
     </w:p>
     <w:p>
       <w:r>
@@ -3855,13 +2886,8 @@
       </w:r>
     </w:p>
     <w:p>
-      <w:proofErr w:type="gramStart"/>
-      <w:r>
-        <w:t>git</w:t>
-      </w:r>
-      <w:proofErr w:type="gramEnd"/>
-      <w:r>
-        <w:t xml:space="preserve"> diff</w:t>
+      <w:r>
+        <w:t>git diff</w:t>
       </w:r>
     </w:p>
     <w:p>
@@ -3935,23 +2961,7 @@
           <w:b/>
           <w:bCs/>
         </w:rPr>
-        <w:t xml:space="preserve">Faire un pull </w:t>
-      </w:r>
-      <w:proofErr w:type="spellStart"/>
-      <w:r>
-        <w:rPr>
-          <w:b/>
-          <w:bCs/>
-        </w:rPr>
-        <w:t>request</w:t>
-      </w:r>
-      <w:proofErr w:type="spellEnd"/>
-      <w:r>
-        <w:rPr>
-          <w:b/>
-          <w:bCs/>
-        </w:rPr>
-        <w:t xml:space="preserve"> :</w:t>
+        <w:t>Faire un pull request :</w:t>
       </w:r>
     </w:p>
     <w:p>
@@ -4015,17 +3025,8 @@
           <w:b/>
           <w:bCs/>
         </w:rPr>
-        <w:t xml:space="preserve">Change repository </w:t>
-      </w:r>
-      <w:proofErr w:type="spellStart"/>
-      <w:r>
-        <w:rPr>
-          <w:b/>
-          <w:bCs/>
-        </w:rPr>
-        <w:t>visibility</w:t>
-      </w:r>
-      <w:proofErr w:type="spellEnd"/>
+        <w:t>Change repository visibility</w:t>
+      </w:r>
       <w:r>
         <w:t>.</w:t>
       </w:r>
@@ -4077,6 +3078,7 @@
       </w:pPr>
       <w:r>
         <w:rPr>
+          <w:noProof/>
           <w:lang w:val="en-US"/>
         </w:rPr>
         <w:drawing>
@@ -4140,43 +3142,21 @@
         <w:rPr>
           <w:lang w:val="en-US"/>
         </w:rPr>
-        <w:t>PS C:\Users\Souleyman\Desktop\Clean_it_Project\MLops_Project\dsti_mlops\unit_perso_project\testP&gt; cd</w:t>
-      </w:r>
-      <w:proofErr w:type="gramStart"/>
-      <w:r>
-        <w:rPr>
-          <w:lang w:val="en-US"/>
-        </w:rPr>
-        <w:t xml:space="preserve"> ..</w:t>
-      </w:r>
-      <w:proofErr w:type="gramEnd"/>
-      <w:r>
-        <w:rPr>
-          <w:lang w:val="en-US"/>
-        </w:rPr>
-        <w:t xml:space="preserve">      </w:t>
-      </w:r>
-    </w:p>
-    <w:p>
-      <w:pPr>
-        <w:rPr>
-          <w:lang w:val="en-US"/>
-        </w:rPr>
-      </w:pPr>
-      <w:r>
-        <w:rPr>
-          <w:lang w:val="en-US"/>
-        </w:rPr>
-        <w:t>PS C:\Users\Souleyman\Desktop\Clean_it_Project\MLops_Project\dsti_mlops\unit_perso_project&gt; cd</w:t>
-      </w:r>
-      <w:proofErr w:type="gramStart"/>
-      <w:r>
-        <w:rPr>
-          <w:lang w:val="en-US"/>
-        </w:rPr>
-        <w:t xml:space="preserve"> ..</w:t>
-      </w:r>
-      <w:proofErr w:type="gramEnd"/>
+        <w:t xml:space="preserve">PS C:\Users\Souleyman\Desktop\Clean_it_Project\MLops_Project\dsti_mlops\unit_perso_project\testP&gt; cd ..      </w:t>
+      </w:r>
+    </w:p>
+    <w:p>
+      <w:pPr>
+        <w:rPr>
+          <w:lang w:val="en-US"/>
+        </w:rPr>
+      </w:pPr>
+      <w:r>
+        <w:rPr>
+          <w:lang w:val="en-US"/>
+        </w:rPr>
+        <w:t>PS C:\Users\Souleyman\Desktop\Clean_it_Project\MLops_Project\dsti_mlops\unit_perso_project&gt; cd ..</w:t>
+      </w:r>
     </w:p>
     <w:p>
       <w:pPr>
@@ -4190,42 +3170,33 @@
           <w:highlight w:val="cyan"/>
           <w:lang w:val="en-US"/>
         </w:rPr>
-        <w:t xml:space="preserve">PS C:\Users\Souleyman\Desktop\Clean_it_Project\MLops_Project\dsti_mlops&gt; git </w:t>
-      </w:r>
-      <w:proofErr w:type="gramStart"/>
+        <w:t>PS C:\Users\Souleyman\Desktop\Clean_it_Project\MLops_Project\dsti_mlops&gt; git add .</w:t>
+      </w:r>
+    </w:p>
+    <w:p>
+      <w:pPr>
+        <w:rPr>
+          <w:lang w:val="en-US"/>
+        </w:rPr>
+      </w:pPr>
       <w:r>
         <w:rPr>
           <w:highlight w:val="cyan"/>
           <w:lang w:val="en-US"/>
         </w:rPr>
-        <w:t>add .</w:t>
-      </w:r>
-      <w:proofErr w:type="gramEnd"/>
-    </w:p>
-    <w:p>
-      <w:pPr>
-        <w:rPr>
-          <w:lang w:val="en-US"/>
-        </w:rPr>
-      </w:pPr>
+        <w:t>PS C:\Users\Souleyman\Desktop\Clean_it_Project\MLops_Project\dsti_mlops&gt; git commit -m</w:t>
+      </w:r>
+      <w:r>
+        <w:rPr>
+          <w:lang w:val="en-US"/>
+        </w:rPr>
+        <w:t xml:space="preserve"> </w:t>
+      </w:r>
       <w:r>
         <w:rPr>
           <w:highlight w:val="cyan"/>
           <w:lang w:val="en-US"/>
         </w:rPr>
-        <w:t>PS C:\Users\Souleyman\Desktop\Clean_it_Project\MLops_Project\dsti_mlops&gt; git commit -m</w:t>
-      </w:r>
-      <w:r>
-        <w:rPr>
-          <w:lang w:val="en-US"/>
-        </w:rPr>
-        <w:t xml:space="preserve"> </w:t>
-      </w:r>
-      <w:r>
-        <w:rPr>
-          <w:highlight w:val="cyan"/>
-          <w:lang w:val="en-US"/>
-        </w:rPr>
         <w:t>'&lt;feat: lab2'</w:t>
       </w:r>
     </w:p>
@@ -4252,21 +3223,7 @@
         <w:rPr>
           <w:lang w:val="en-US"/>
         </w:rPr>
-        <w:t xml:space="preserve"> 5 files changed, 67 </w:t>
-      </w:r>
-      <w:proofErr w:type="gramStart"/>
-      <w:r>
-        <w:rPr>
-          <w:lang w:val="en-US"/>
-        </w:rPr>
-        <w:t>insertions(</w:t>
-      </w:r>
-      <w:proofErr w:type="gramEnd"/>
-      <w:r>
-        <w:rPr>
-          <w:lang w:val="en-US"/>
-        </w:rPr>
-        <w:t>+)</w:t>
+        <w:t xml:space="preserve"> 5 files changed, 67 insertions(+)</w:t>
       </w:r>
     </w:p>
     <w:p>
@@ -4476,35 +3433,7 @@
         <w:rPr>
           <w:lang w:val="en-US"/>
         </w:rPr>
-        <w:t xml:space="preserve">   870733</w:t>
-      </w:r>
-      <w:proofErr w:type="gramStart"/>
-      <w:r>
-        <w:rPr>
-          <w:lang w:val="en-US"/>
-        </w:rPr>
-        <w:t>c..</w:t>
-      </w:r>
-      <w:proofErr w:type="gramEnd"/>
-      <w:r>
-        <w:rPr>
-          <w:lang w:val="en-US"/>
-        </w:rPr>
-        <w:t>bce3b</w:t>
-      </w:r>
-      <w:proofErr w:type="gramStart"/>
-      <w:r>
-        <w:rPr>
-          <w:lang w:val="en-US"/>
-        </w:rPr>
-        <w:t>59  feature</w:t>
-      </w:r>
-      <w:proofErr w:type="gramEnd"/>
-      <w:r>
-        <w:rPr>
-          <w:lang w:val="en-US"/>
-        </w:rPr>
-        <w:t>/dev-MAHAMADENE -&gt; feature/dev-MAHAMADENE</w:t>
+        <w:t xml:space="preserve">   870733c..bce3b59  feature/dev-MAHAMADENE -&gt; feature/dev-MAHAMADENE</w:t>
       </w:r>
     </w:p>
     <w:p>
@@ -4521,19 +3450,11 @@
       </w:r>
     </w:p>
     <w:p>
-      <w:proofErr w:type="gramStart"/>
       <w:r>
         <w:rPr>
           <w:highlight w:val="cyan"/>
         </w:rPr>
-        <w:t>git</w:t>
-      </w:r>
-      <w:proofErr w:type="gramEnd"/>
-      <w:r>
-        <w:rPr>
-          <w:highlight w:val="cyan"/>
-        </w:rPr>
-        <w:t xml:space="preserve"> rebase </w:t>
+        <w:t xml:space="preserve">git rebase </w:t>
       </w:r>
       <w:r>
         <w:rPr>
@@ -4573,43 +3494,21 @@
         <w:rPr>
           <w:lang w:val="en-US"/>
         </w:rPr>
-        <w:t>PS C:\Users\Souleyman\Desktop\Clean_it_Project\MLops_Project\dsti_mlops\unit_perso_project\testP&gt; cd</w:t>
-      </w:r>
-      <w:proofErr w:type="gramStart"/>
-      <w:r>
-        <w:rPr>
-          <w:lang w:val="en-US"/>
-        </w:rPr>
-        <w:t xml:space="preserve"> ..</w:t>
-      </w:r>
-      <w:proofErr w:type="gramEnd"/>
-      <w:r>
-        <w:rPr>
-          <w:lang w:val="en-US"/>
-        </w:rPr>
-        <w:t xml:space="preserve">      </w:t>
-      </w:r>
-    </w:p>
-    <w:p>
-      <w:pPr>
-        <w:rPr>
-          <w:lang w:val="en-US"/>
-        </w:rPr>
-      </w:pPr>
-      <w:r>
-        <w:rPr>
-          <w:lang w:val="en-US"/>
-        </w:rPr>
-        <w:t>PS C:\Users\Souleyman\Desktop\Clean_it_Project\MLops_Project\dsti_mlops\unit_perso_project&gt; cd</w:t>
-      </w:r>
-      <w:proofErr w:type="gramStart"/>
-      <w:r>
-        <w:rPr>
-          <w:lang w:val="en-US"/>
-        </w:rPr>
-        <w:t xml:space="preserve"> ..</w:t>
-      </w:r>
-      <w:proofErr w:type="gramEnd"/>
+        <w:t xml:space="preserve">PS C:\Users\Souleyman\Desktop\Clean_it_Project\MLops_Project\dsti_mlops\unit_perso_project\testP&gt; cd ..      </w:t>
+      </w:r>
+    </w:p>
+    <w:p>
+      <w:pPr>
+        <w:rPr>
+          <w:lang w:val="en-US"/>
+        </w:rPr>
+      </w:pPr>
+      <w:r>
+        <w:rPr>
+          <w:lang w:val="en-US"/>
+        </w:rPr>
+        <w:t>PS C:\Users\Souleyman\Desktop\Clean_it_Project\MLops_Project\dsti_mlops\unit_perso_project&gt; cd ..</w:t>
+      </w:r>
     </w:p>
     <w:p>
       <w:pPr>
@@ -4622,29 +3521,20 @@
           <w:highlight w:val="cyan"/>
           <w:lang w:val="en-US"/>
         </w:rPr>
-        <w:t xml:space="preserve">PS C:\Users\Souleyman\Desktop\Clean_it_Project\MLops_Project\dsti_mlops&gt; git </w:t>
-      </w:r>
-      <w:proofErr w:type="gramStart"/>
+        <w:t>PS C:\Users\Souleyman\Desktop\Clean_it_Project\MLops_Project\dsti_mlops&gt; git add .</w:t>
+      </w:r>
+    </w:p>
+    <w:p>
+      <w:pPr>
+        <w:rPr>
+          <w:lang w:val="en-US"/>
+        </w:rPr>
+      </w:pPr>
       <w:r>
         <w:rPr>
           <w:highlight w:val="cyan"/>
           <w:lang w:val="en-US"/>
         </w:rPr>
-        <w:t>add .</w:t>
-      </w:r>
-      <w:proofErr w:type="gramEnd"/>
-    </w:p>
-    <w:p>
-      <w:pPr>
-        <w:rPr>
-          <w:lang w:val="en-US"/>
-        </w:rPr>
-      </w:pPr>
-      <w:r>
-        <w:rPr>
-          <w:highlight w:val="cyan"/>
-          <w:lang w:val="en-US"/>
-        </w:rPr>
         <w:t>PS C:\Users\Souleyman\Desktop\Clean_it_Project\MLops_Project\dsti_mlops&gt; git commit -m '&lt;feat: lab2'</w:t>
       </w:r>
     </w:p>
@@ -4671,21 +3561,7 @@
         <w:rPr>
           <w:lang w:val="en-US"/>
         </w:rPr>
-        <w:t xml:space="preserve"> 5 files changed, 67 </w:t>
-      </w:r>
-      <w:proofErr w:type="gramStart"/>
-      <w:r>
-        <w:rPr>
-          <w:lang w:val="en-US"/>
-        </w:rPr>
-        <w:t>insertions(</w:t>
-      </w:r>
-      <w:proofErr w:type="gramEnd"/>
-      <w:r>
-        <w:rPr>
-          <w:lang w:val="en-US"/>
-        </w:rPr>
-        <w:t>+)</w:t>
+        <w:t xml:space="preserve"> 5 files changed, 67 insertions(+)</w:t>
       </w:r>
     </w:p>
     <w:p>
@@ -4895,35 +3771,7 @@
         <w:rPr>
           <w:lang w:val="en-US"/>
         </w:rPr>
-        <w:t xml:space="preserve">   870733</w:t>
-      </w:r>
-      <w:proofErr w:type="gramStart"/>
-      <w:r>
-        <w:rPr>
-          <w:lang w:val="en-US"/>
-        </w:rPr>
-        <w:t>c..</w:t>
-      </w:r>
-      <w:proofErr w:type="gramEnd"/>
-      <w:r>
-        <w:rPr>
-          <w:lang w:val="en-US"/>
-        </w:rPr>
-        <w:t>bce3b</w:t>
-      </w:r>
-      <w:proofErr w:type="gramStart"/>
-      <w:r>
-        <w:rPr>
-          <w:lang w:val="en-US"/>
-        </w:rPr>
-        <w:t>59  feature</w:t>
-      </w:r>
-      <w:proofErr w:type="gramEnd"/>
-      <w:r>
-        <w:rPr>
-          <w:lang w:val="en-US"/>
-        </w:rPr>
-        <w:t>/dev-MAHAMADENE -&gt; feature/dev-MAHAMADENE</w:t>
+        <w:t xml:space="preserve">   870733c..bce3b59  feature/dev-MAHAMADENE -&gt; feature/dev-MAHAMADENE</w:t>
       </w:r>
     </w:p>
     <w:p>
@@ -5029,21 +3877,7 @@
         <w:rPr>
           <w:lang w:val="en-US"/>
         </w:rPr>
-        <w:t xml:space="preserve"> README.md                                          </w:t>
-      </w:r>
-      <w:proofErr w:type="gramStart"/>
-      <w:r>
-        <w:rPr>
-          <w:lang w:val="en-US"/>
-        </w:rPr>
-        <w:t>|  4</w:t>
-      </w:r>
-      <w:proofErr w:type="gramEnd"/>
-      <w:r>
-        <w:rPr>
-          <w:lang w:val="en-US"/>
-        </w:rPr>
-        <w:t xml:space="preserve"> +-</w:t>
+        <w:t xml:space="preserve"> README.md                                          |  4 +-</w:t>
       </w:r>
     </w:p>
     <w:p>
@@ -5095,75 +3929,33 @@
         <w:rPr>
           <w:lang w:val="en-US"/>
         </w:rPr>
-        <w:t xml:space="preserve"> unit_testing_best_practice/test/test_sample.py     </w:t>
-      </w:r>
-      <w:proofErr w:type="gramStart"/>
-      <w:r>
-        <w:rPr>
-          <w:lang w:val="en-US"/>
-        </w:rPr>
-        <w:t>|  8</w:t>
-      </w:r>
-      <w:proofErr w:type="gramEnd"/>
-      <w:r>
-        <w:rPr>
-          <w:lang w:val="en-US"/>
-        </w:rPr>
-        <w:t xml:space="preserve"> +++</w:t>
-      </w:r>
-    </w:p>
-    <w:p>
-      <w:pPr>
-        <w:rPr>
-          <w:lang w:val="en-US"/>
-        </w:rPr>
-      </w:pPr>
-      <w:r>
-        <w:rPr>
-          <w:lang w:val="en-US"/>
-        </w:rPr>
-        <w:t xml:space="preserve"> unit_testing_simple/test_sample.py                 </w:t>
-      </w:r>
-      <w:proofErr w:type="gramStart"/>
-      <w:r>
-        <w:rPr>
-          <w:lang w:val="en-US"/>
-        </w:rPr>
-        <w:t>|  5</w:t>
-      </w:r>
-      <w:proofErr w:type="gramEnd"/>
-      <w:r>
-        <w:rPr>
-          <w:lang w:val="en-US"/>
-        </w:rPr>
-        <w:t xml:space="preserve"> ++</w:t>
-      </w:r>
-    </w:p>
-    <w:p>
-      <w:pPr>
-        <w:rPr>
-          <w:lang w:val="en-US"/>
-        </w:rPr>
-      </w:pPr>
-      <w:r>
-        <w:rPr>
-          <w:lang w:val="en-US"/>
-        </w:rPr>
-        <w:t xml:space="preserve"> 6 files changed, 158 </w:t>
-      </w:r>
-      <w:proofErr w:type="gramStart"/>
-      <w:r>
-        <w:rPr>
-          <w:lang w:val="en-US"/>
-        </w:rPr>
-        <w:t>insertions(</w:t>
-      </w:r>
-      <w:proofErr w:type="gramEnd"/>
-      <w:r>
-        <w:rPr>
-          <w:lang w:val="en-US"/>
-        </w:rPr>
-        <w:t>+), 1 deletion(-)</w:t>
+        <w:t xml:space="preserve"> unit_testing_best_practice/test/test_sample.py     |  8 +++</w:t>
+      </w:r>
+    </w:p>
+    <w:p>
+      <w:pPr>
+        <w:rPr>
+          <w:lang w:val="en-US"/>
+        </w:rPr>
+      </w:pPr>
+      <w:r>
+        <w:rPr>
+          <w:lang w:val="en-US"/>
+        </w:rPr>
+        <w:t xml:space="preserve"> unit_testing_simple/test_sample.py                 |  5 ++</w:t>
+      </w:r>
+    </w:p>
+    <w:p>
+      <w:pPr>
+        <w:rPr>
+          <w:lang w:val="en-US"/>
+        </w:rPr>
+      </w:pPr>
+      <w:r>
+        <w:rPr>
+          <w:lang w:val="en-US"/>
+        </w:rPr>
+        <w:t xml:space="preserve"> 6 files changed, 158 insertions(+), 1 deletion(-)</w:t>
       </w:r>
     </w:p>
     <w:p>
@@ -5316,47 +4108,25 @@
           <w:lang w:val="en-US"/>
         </w:rPr>
       </w:pPr>
-      <w:proofErr w:type="gramStart"/>
       <w:r>
         <w:rPr>
           <w:lang w:val="en-US"/>
         </w:rPr>
         <w:lastRenderedPageBreak/>
-        <w:t>hint</w:t>
-      </w:r>
-      <w:proofErr w:type="gramEnd"/>
-      <w:r>
-        <w:rPr>
-          <w:lang w:val="en-US"/>
-        </w:rPr>
-        <w:t>: Resolve all conflicts manually, mark them as resolved with</w:t>
-      </w:r>
-    </w:p>
-    <w:p>
-      <w:pPr>
-        <w:rPr>
-          <w:lang w:val="en-US"/>
-        </w:rPr>
-      </w:pPr>
-      <w:r>
-        <w:rPr>
-          <w:lang w:val="en-US"/>
-        </w:rPr>
-        <w:t>hint: "git add/rm &lt;</w:t>
-      </w:r>
-      <w:proofErr w:type="spellStart"/>
-      <w:r>
-        <w:rPr>
-          <w:lang w:val="en-US"/>
-        </w:rPr>
-        <w:t>conflicted_files</w:t>
-      </w:r>
-      <w:proofErr w:type="spellEnd"/>
-      <w:r>
-        <w:rPr>
-          <w:lang w:val="en-US"/>
-        </w:rPr>
-        <w:t>&gt;", then run "git rebase --continue".</w:t>
+        <w:t>hint: Resolve all conflicts manually, mark them as resolved with</w:t>
+      </w:r>
+    </w:p>
+    <w:p>
+      <w:pPr>
+        <w:rPr>
+          <w:lang w:val="en-US"/>
+        </w:rPr>
+      </w:pPr>
+      <w:r>
+        <w:rPr>
+          <w:lang w:val="en-US"/>
+        </w:rPr>
+        <w:t>hint: "git add/rm &lt;conflicted_files&gt;", then run "git rebase --continue".</w:t>
       </w:r>
     </w:p>
     <w:p>
@@ -5378,19 +4148,11 @@
           <w:lang w:val="en-US"/>
         </w:rPr>
       </w:pPr>
-      <w:proofErr w:type="gramStart"/>
-      <w:r>
-        <w:rPr>
-          <w:lang w:val="en-US"/>
-        </w:rPr>
-        <w:t>hint</w:t>
-      </w:r>
-      <w:proofErr w:type="gramEnd"/>
-      <w:r>
-        <w:rPr>
-          <w:lang w:val="en-US"/>
-        </w:rPr>
-        <w:t>: To abort and get back to the state before "git rebase", run "git rebase --abort".</w:t>
+      <w:r>
+        <w:rPr>
+          <w:lang w:val="en-US"/>
+        </w:rPr>
+        <w:t>hint: To abort and get back to the state before "git rebase", run "git rebase --abort".</w:t>
       </w:r>
     </w:p>
     <w:p>
@@ -5547,48 +4309,20 @@
         <w:rPr>
           <w:lang w:val="en-US"/>
         </w:rPr>
-        <w:t xml:space="preserve">   e46af</w:t>
-      </w:r>
-      <w:proofErr w:type="gramStart"/>
-      <w:r>
-        <w:rPr>
-          <w:lang w:val="en-US"/>
-        </w:rPr>
-        <w:t>93..</w:t>
-      </w:r>
-      <w:proofErr w:type="gramEnd"/>
-      <w:r>
-        <w:rPr>
-          <w:lang w:val="en-US"/>
-        </w:rPr>
-        <w:t>3c597e5  develop    -&gt; origin/develop</w:t>
-      </w:r>
-    </w:p>
-    <w:p>
-      <w:pPr>
-        <w:rPr>
-          <w:lang w:val="en-US"/>
-        </w:rPr>
-      </w:pPr>
-      <w:r>
-        <w:rPr>
-          <w:lang w:val="en-US"/>
-        </w:rPr>
-        <w:t>Updating e46af</w:t>
-      </w:r>
-      <w:proofErr w:type="gramStart"/>
-      <w:r>
-        <w:rPr>
-          <w:lang w:val="en-US"/>
-        </w:rPr>
-        <w:t>93..</w:t>
-      </w:r>
-      <w:proofErr w:type="gramEnd"/>
-      <w:r>
-        <w:rPr>
-          <w:lang w:val="en-US"/>
-        </w:rPr>
-        <w:t>3c597e5</w:t>
+        <w:t xml:space="preserve">   e46af93..3c597e5  develop    -&gt; origin/develop</w:t>
+      </w:r>
+    </w:p>
+    <w:p>
+      <w:pPr>
+        <w:rPr>
+          <w:lang w:val="en-US"/>
+        </w:rPr>
+      </w:pPr>
+      <w:r>
+        <w:rPr>
+          <w:lang w:val="en-US"/>
+        </w:rPr>
+        <w:t>Updating e46af93..3c597e5</w:t>
       </w:r>
     </w:p>
     <w:p>
@@ -5640,75 +4374,33 @@
         <w:rPr>
           <w:lang w:val="en-US"/>
         </w:rPr>
-        <w:t xml:space="preserve"> unit_testing_best_practice/src/sample.py       </w:t>
-      </w:r>
-      <w:proofErr w:type="gramStart"/>
-      <w:r>
-        <w:rPr>
-          <w:lang w:val="en-US"/>
-        </w:rPr>
-        <w:t>|  5</w:t>
-      </w:r>
-      <w:proofErr w:type="gramEnd"/>
-      <w:r>
-        <w:rPr>
-          <w:lang w:val="en-US"/>
-        </w:rPr>
-        <w:t xml:space="preserve"> +++++</w:t>
-      </w:r>
-    </w:p>
-    <w:p>
-      <w:pPr>
-        <w:rPr>
-          <w:lang w:val="en-US"/>
-        </w:rPr>
-      </w:pPr>
-      <w:r>
-        <w:rPr>
-          <w:lang w:val="en-US"/>
-        </w:rPr>
-        <w:t xml:space="preserve"> unit_testing_best_practice/test/test_sample.py </w:t>
-      </w:r>
-      <w:proofErr w:type="gramStart"/>
-      <w:r>
-        <w:rPr>
-          <w:lang w:val="en-US"/>
-        </w:rPr>
-        <w:t>|  4</w:t>
-      </w:r>
-      <w:proofErr w:type="gramEnd"/>
-      <w:r>
-        <w:rPr>
-          <w:lang w:val="en-US"/>
-        </w:rPr>
-        <w:t xml:space="preserve"> +++-</w:t>
-      </w:r>
-    </w:p>
-    <w:p>
-      <w:pPr>
-        <w:rPr>
-          <w:lang w:val="en-US"/>
-        </w:rPr>
-      </w:pPr>
-      <w:r>
-        <w:rPr>
-          <w:lang w:val="en-US"/>
-        </w:rPr>
-        <w:t xml:space="preserve"> 4 files changed, 58 </w:t>
-      </w:r>
-      <w:proofErr w:type="gramStart"/>
-      <w:r>
-        <w:rPr>
-          <w:lang w:val="en-US"/>
-        </w:rPr>
-        <w:t>insertions(</w:t>
-      </w:r>
-      <w:proofErr w:type="gramEnd"/>
-      <w:r>
-        <w:rPr>
-          <w:lang w:val="en-US"/>
-        </w:rPr>
-        <w:t>+), 1 deletion(-)</w:t>
+        <w:t xml:space="preserve"> unit_testing_best_practice/src/sample.py       |  5 +++++</w:t>
+      </w:r>
+    </w:p>
+    <w:p>
+      <w:pPr>
+        <w:rPr>
+          <w:lang w:val="en-US"/>
+        </w:rPr>
+      </w:pPr>
+      <w:r>
+        <w:rPr>
+          <w:lang w:val="en-US"/>
+        </w:rPr>
+        <w:t xml:space="preserve"> unit_testing_best_practice/test/test_sample.py |  4 +++-</w:t>
+      </w:r>
+    </w:p>
+    <w:p>
+      <w:pPr>
+        <w:rPr>
+          <w:lang w:val="en-US"/>
+        </w:rPr>
+      </w:pPr>
+      <w:r>
+        <w:rPr>
+          <w:lang w:val="en-US"/>
+        </w:rPr>
+        <w:t xml:space="preserve"> 4 files changed, 58 insertions(+), 1 deletion(-)</w:t>
       </w:r>
     </w:p>
     <w:p>
@@ -5749,6 +4441,356 @@
         </w:rPr>
         <w:t>PS C:\Users\Souleyman\Desktop\Clean_it_Project\MLops_Project\dsti_mlops&gt;</w:t>
       </w:r>
+    </w:p>
+    <w:p>
+      <w:pPr>
+        <w:rPr>
+          <w:lang w:val="en-US"/>
+        </w:rPr>
+      </w:pPr>
+    </w:p>
+    <w:p>
+      <w:pPr>
+        <w:rPr>
+          <w:lang w:val="en-US"/>
+        </w:rPr>
+      </w:pPr>
+    </w:p>
+    <w:p>
+      <w:pPr>
+        <w:rPr>
+          <w:lang w:val="en-US"/>
+        </w:rPr>
+      </w:pPr>
+    </w:p>
+    <w:p>
+      <w:pPr>
+        <w:rPr>
+          <w:lang w:val="en-US"/>
+        </w:rPr>
+      </w:pPr>
+    </w:p>
+    <w:p>
+      <w:pPr>
+        <w:rPr>
+          <w:lang w:val="en-US"/>
+        </w:rPr>
+      </w:pPr>
+    </w:p>
+    <w:p>
+      <w:pPr>
+        <w:rPr>
+          <w:lang w:val="en-US"/>
+        </w:rPr>
+      </w:pPr>
+      <w:r>
+        <w:rPr>
+          <w:lang w:val="en-US"/>
+        </w:rPr>
+        <w:tab/>
+      </w:r>
+      <w:r>
+        <w:rPr>
+          <w:lang w:val="en-US"/>
+        </w:rPr>
+        <w:tab/>
+      </w:r>
+      <w:r>
+        <w:rPr>
+          <w:lang w:val="en-US"/>
+        </w:rPr>
+        <w:tab/>
+      </w:r>
+      <w:r>
+        <w:rPr>
+          <w:lang w:val="en-US"/>
+        </w:rPr>
+        <w:tab/>
+      </w:r>
+      <w:r>
+        <w:rPr>
+          <w:lang w:val="en-US"/>
+        </w:rPr>
+        <w:tab/>
+        <w:t xml:space="preserve">   </w:t>
+      </w:r>
+      <w:r>
+        <w:rPr>
+          <w:lang w:val="en-US"/>
+        </w:rPr>
+        <w:tab/>
+      </w:r>
+      <w:r>
+        <w:rPr>
+          <w:lang w:val="en-US"/>
+        </w:rPr>
+        <w:tab/>
+      </w:r>
+      <w:r>
+        <w:rPr>
+          <w:lang w:val="en-US"/>
+        </w:rPr>
+        <w:tab/>
+      </w:r>
+      <w:r>
+        <w:rPr>
+          <w:highlight w:val="yellow"/>
+          <w:lang w:val="en-US"/>
+        </w:rPr>
+        <w:t>Le 09/11/2025</w:t>
+      </w:r>
+    </w:p>
+    <w:p>
+      <w:pPr>
+        <w:rPr>
+          <w:b/>
+          <w:bCs/>
+        </w:rPr>
+      </w:pPr>
+      <w:r>
+        <w:rPr>
+          <w:highlight w:val="cyan"/>
+          <w:lang w:val="en-US"/>
+        </w:rPr>
+        <w:t>La mise à jour du repertoire git hub All Project</w:t>
+      </w:r>
+      <w:r>
+        <w:rPr>
+          <w:b/>
+          <w:bCs/>
+        </w:rPr>
+        <w:t xml:space="preserve"> </w:t>
+      </w:r>
+    </w:p>
+    <w:p>
+      <w:pPr>
+        <w:rPr>
+          <w:lang w:val="en-US"/>
+        </w:rPr>
+      </w:pPr>
+      <w:r>
+        <w:rPr>
+          <w:b/>
+          <w:bCs/>
+        </w:rPr>
+        <w:t>Si tu veux tout pousser (même les fichiers hors dossier)</w:t>
+      </w:r>
+    </w:p>
+    <w:p>
+      <w:r>
+        <w:t>Fais simplement :</w:t>
+      </w:r>
+    </w:p>
+    <w:p>
+      <w:r>
+        <w:t>git add -A</w:t>
+      </w:r>
+    </w:p>
+    <w:p>
+      <w:r>
+        <w:t>git commit -m "Mise à jour globale du projet"</w:t>
+      </w:r>
+    </w:p>
+    <w:p>
+      <w:r>
+        <w:t>git push origin main</w:t>
+      </w:r>
+    </w:p>
+    <w:p/>
+    <w:p>
+      <w:r>
+        <w:rPr>
+          <w:highlight w:val="cyan"/>
+        </w:rPr>
+        <w:t xml:space="preserve">Tu peux mettre à jour ton </w:t>
+      </w:r>
+      <w:r>
+        <w:rPr>
+          <w:i/>
+          <w:iCs/>
+          <w:highlight w:val="cyan"/>
+        </w:rPr>
+        <w:t>remote</w:t>
+      </w:r>
+      <w:r>
+        <w:rPr>
+          <w:highlight w:val="cyan"/>
+        </w:rPr>
+        <w:t xml:space="preserve"> avec cette commande :</w:t>
+      </w:r>
+    </w:p>
+    <w:p>
+      <w:r>
+        <w:t xml:space="preserve">git remote set-url origin </w:t>
+      </w:r>
+      <w:hyperlink r:id="rId17" w:history="1">
+        <w:r>
+          <w:rPr>
+            <w:rStyle w:val="Lienhypertexte"/>
+          </w:rPr>
+          <w:t>https://github.com/SouleymaMahamadene/Projects_Personel.git</w:t>
+        </w:r>
+      </w:hyperlink>
+    </w:p>
+    <w:p>
+      <w:r>
+        <w:rPr>
+          <w:highlight w:val="cyan"/>
+        </w:rPr>
+        <w:t>Ensuite, vérifie avec :</w:t>
+      </w:r>
+    </w:p>
+    <w:p>
+      <w:r>
+        <w:t>git remote -v</w:t>
+      </w:r>
+    </w:p>
+    <w:p>
+      <w:r>
+        <w:rPr>
+          <w:highlight w:val="cyan"/>
+        </w:rPr>
+        <w:t>Tu devrais voir :</w:t>
+      </w:r>
+    </w:p>
+    <w:p>
+      <w:r>
+        <w:t>origin  https://github.com/SouleymaMahamadene/Projects_Personel.git (fetch)</w:t>
+      </w:r>
+    </w:p>
+    <w:p>
+      <w:r>
+        <w:t>origin  https://github.com/SouleymaMahamadene/Projects_Personel.git (push)</w:t>
+      </w:r>
+    </w:p>
+    <w:p>
+      <w:r>
+        <w:t>c’est bon parfait, voir cette figure ci-dessous :</w:t>
+      </w:r>
+    </w:p>
+    <w:p>
+      <w:r>
+        <w:drawing>
+          <wp:inline distT="0" distB="0" distL="0" distR="0" wp14:anchorId="2873D163" wp14:editId="678675F1">
+            <wp:extent cx="5760720" cy="3779520"/>
+            <wp:effectExtent l="0" t="0" r="0" b="0"/>
+            <wp:docPr id="276813241" name="Image 1" descr="Une image contenant texte, capture d’écran, logiciel, Logiciel multimédia&#10;&#10;Le contenu généré par l’IA peut être incorrect."/>
+            <wp:cNvGraphicFramePr>
+              <a:graphicFrameLocks xmlns:a="http://schemas.openxmlformats.org/drawingml/2006/main" noChangeAspect="1"/>
+            </wp:cNvGraphicFramePr>
+            <a:graphic xmlns:a="http://schemas.openxmlformats.org/drawingml/2006/main">
+              <a:graphicData uri="http://schemas.openxmlformats.org/drawingml/2006/picture">
+                <pic:pic xmlns:pic="http://schemas.openxmlformats.org/drawingml/2006/picture">
+                  <pic:nvPicPr>
+                    <pic:cNvPr id="276813241" name="Image 1" descr="Une image contenant texte, capture d’écran, logiciel, Logiciel multimédia&#10;&#10;Le contenu généré par l’IA peut être incorrect."/>
+                    <pic:cNvPicPr/>
+                  </pic:nvPicPr>
+                  <pic:blipFill>
+                    <a:blip r:embed="rId18"/>
+                    <a:stretch>
+                      <a:fillRect/>
+                    </a:stretch>
+                  </pic:blipFill>
+                  <pic:spPr>
+                    <a:xfrm>
+                      <a:off x="0" y="0"/>
+                      <a:ext cx="5760720" cy="3779520"/>
+                    </a:xfrm>
+                    <a:prstGeom prst="rect">
+                      <a:avLst/>
+                    </a:prstGeom>
+                  </pic:spPr>
+                </pic:pic>
+              </a:graphicData>
+            </a:graphic>
+          </wp:inline>
+        </w:drawing>
+      </w:r>
+    </w:p>
+    <w:p>
+      <w:r>
+        <w:lastRenderedPageBreak/>
+        <w:tab/>
+      </w:r>
+      <w:r>
+        <w:tab/>
+      </w:r>
+      <w:r>
+        <w:tab/>
+      </w:r>
+      <w:r>
+        <w:tab/>
+      </w:r>
+      <w:r>
+        <w:tab/>
+      </w:r>
+      <w:r>
+        <w:tab/>
+      </w:r>
+      <w:r>
+        <w:tab/>
+      </w:r>
+      <w:r>
+        <w:tab/>
+      </w:r>
+      <w:r>
+        <w:tab/>
+        <w:t>Le 09/11/2025</w:t>
+      </w:r>
+    </w:p>
+    <w:p/>
+    <w:p>
+      <w:r>
+        <w:drawing>
+          <wp:inline distT="0" distB="0" distL="0" distR="0" wp14:anchorId="2D771DC6" wp14:editId="5D05CE33">
+            <wp:extent cx="5760720" cy="2918460"/>
+            <wp:effectExtent l="0" t="0" r="0" b="0"/>
+            <wp:docPr id="1131393432" name="Image 1" descr="Une image contenant texte, capture d’écran, logiciel, Page web&#10;&#10;Le contenu généré par l’IA peut être incorrect."/>
+            <wp:cNvGraphicFramePr>
+              <a:graphicFrameLocks xmlns:a="http://schemas.openxmlformats.org/drawingml/2006/main" noChangeAspect="1"/>
+            </wp:cNvGraphicFramePr>
+            <a:graphic xmlns:a="http://schemas.openxmlformats.org/drawingml/2006/main">
+              <a:graphicData uri="http://schemas.openxmlformats.org/drawingml/2006/picture">
+                <pic:pic xmlns:pic="http://schemas.openxmlformats.org/drawingml/2006/picture">
+                  <pic:nvPicPr>
+                    <pic:cNvPr id="1131393432" name="Image 1" descr="Une image contenant texte, capture d’écran, logiciel, Page web&#10;&#10;Le contenu généré par l’IA peut être incorrect."/>
+                    <pic:cNvPicPr/>
+                  </pic:nvPicPr>
+                  <pic:blipFill>
+                    <a:blip r:embed="rId19"/>
+                    <a:stretch>
+                      <a:fillRect/>
+                    </a:stretch>
+                  </pic:blipFill>
+                  <pic:spPr>
+                    <a:xfrm>
+                      <a:off x="0" y="0"/>
+                      <a:ext cx="5760720" cy="2918460"/>
+                    </a:xfrm>
+                    <a:prstGeom prst="rect">
+                      <a:avLst/>
+                    </a:prstGeom>
+                  </pic:spPr>
+                </pic:pic>
+              </a:graphicData>
+            </a:graphic>
+          </wp:inline>
+        </w:drawing>
+      </w:r>
+    </w:p>
+    <w:p>
+      <w:pPr>
+        <w:rPr>
+          <w:lang w:val="en-US"/>
+        </w:rPr>
+      </w:pPr>
+    </w:p>
+    <w:p>
+      <w:pPr>
+        <w:rPr>
+          <w:lang w:val="en-US"/>
+        </w:rPr>
+      </w:pPr>
     </w:p>
     <w:sectPr>
       <w:pgSz w:w="11906" w:h="16838"/>
@@ -5761,7 +4803,7 @@
 </file>
 
 <file path=word/numbering.xml><?xml version="1.0" encoding="utf-8"?>
-<w:numbering xmlns:wpc="http://schemas.microsoft.com/office/word/2010/wordprocessingCanvas" xmlns:cx="http://schemas.microsoft.com/office/drawing/2014/chartex" xmlns:cx1="http://schemas.microsoft.com/office/drawing/2015/9/8/chartex" xmlns:cx2="http://schemas.microsoft.com/office/drawing/2015/10/21/chartex" xmlns:cx3="http://schemas.microsoft.com/office/drawing/2016/5/9/chartex" xmlns:cx4="http://schemas.microsoft.com/office/drawing/2016/5/10/chartex" xmlns:cx5="http://schemas.microsoft.com/office/drawing/2016/5/11/chartex" xmlns:cx6="http://schemas.microsoft.com/office/drawing/2016/5/12/chartex" xmlns:cx7="http://schemas.microsoft.com/office/drawing/2016/5/13/chartex" xmlns:cx8="http://schemas.microsoft.com/office/drawing/2016/5/14/chartex" xmlns:mc="http://schemas.openxmlformats.org/markup-compatibility/2006" xmlns:aink="http://schemas.microsoft.com/office/drawing/2016/ink" xmlns:am3d="http://schemas.microsoft.com/office/drawing/2017/model3d" xmlns:o="urn:schemas-microsoft-com:office:office" xmlns:oel="http://schemas.microsoft.com/office/2019/extlst" xmlns:r="http://schemas.openxmlformats.org/officeDocument/2006/relationships" xmlns:m="http://schemas.openxmlformats.org/officeDocument/2006/math" xmlns:v="urn:schemas-microsoft-com:vml" xmlns:wp14="http://schemas.microsoft.com/office/word/2010/wordprocessingDrawing" xmlns:wp="http://schemas.openxmlformats.org/drawingml/2006/wordprocessingDrawing" xmlns:w10="urn:schemas-microsoft-com:office:word" xmlns:w="http://schemas.openxmlformats.org/wordprocessingml/2006/main" xmlns:w14="http://schemas.microsoft.com/office/word/2010/wordml" xmlns:w15="http://schemas.microsoft.com/office/word/2012/wordml" xmlns:w16cex="http://schemas.microsoft.com/office/word/2018/wordml/cex" xmlns:w16cid="http://schemas.microsoft.com/office/word/2016/wordml/cid" xmlns:w16="http://schemas.microsoft.com/office/word/2018/wordml" xmlns:w16du="http://schemas.microsoft.com/office/word/2023/wordml/word16du" xmlns:w16sdtdh="http://schemas.microsoft.com/office/word/2020/wordml/sdtdatahash" xmlns:w16se="http://schemas.microsoft.com/office/word/2015/wordml/symex" xmlns:wpg="http://schemas.microsoft.com/office/word/2010/wordprocessingGroup" xmlns:wpi="http://schemas.microsoft.com/office/word/2010/wordprocessingInk" xmlns:wne="http://schemas.microsoft.com/office/word/2006/wordml" xmlns:wps="http://schemas.microsoft.com/office/word/2010/wordprocessingShape" mc:Ignorable="w14 w15 w16se w16cid w16 w16cex w16sdtdh w16du wp14">
+<w:numbering xmlns:wpc="http://schemas.microsoft.com/office/word/2010/wordprocessingCanvas" xmlns:cx="http://schemas.microsoft.com/office/drawing/2014/chartex" xmlns:cx1="http://schemas.microsoft.com/office/drawing/2015/9/8/chartex" xmlns:cx2="http://schemas.microsoft.com/office/drawing/2015/10/21/chartex" xmlns:cx3="http://schemas.microsoft.com/office/drawing/2016/5/9/chartex" xmlns:cx4="http://schemas.microsoft.com/office/drawing/2016/5/10/chartex" xmlns:cx5="http://schemas.microsoft.com/office/drawing/2016/5/11/chartex" xmlns:cx6="http://schemas.microsoft.com/office/drawing/2016/5/12/chartex" xmlns:cx7="http://schemas.microsoft.com/office/drawing/2016/5/13/chartex" xmlns:cx8="http://schemas.microsoft.com/office/drawing/2016/5/14/chartex" xmlns:mc="http://schemas.openxmlformats.org/markup-compatibility/2006" xmlns:aink="http://schemas.microsoft.com/office/drawing/2016/ink" xmlns:am3d="http://schemas.microsoft.com/office/drawing/2017/model3d" xmlns:o="urn:schemas-microsoft-com:office:office" xmlns:oel="http://schemas.microsoft.com/office/2019/extlst" xmlns:r="http://schemas.openxmlformats.org/officeDocument/2006/relationships" xmlns:m="http://schemas.openxmlformats.org/officeDocument/2006/math" xmlns:v="urn:schemas-microsoft-com:vml" xmlns:wp14="http://schemas.microsoft.com/office/word/2010/wordprocessingDrawing" xmlns:wp="http://schemas.openxmlformats.org/drawingml/2006/wordprocessingDrawing" xmlns:w10="urn:schemas-microsoft-com:office:word" xmlns:w="http://schemas.openxmlformats.org/wordprocessingml/2006/main" xmlns:w14="http://schemas.microsoft.com/office/word/2010/wordml" xmlns:w15="http://schemas.microsoft.com/office/word/2012/wordml" xmlns:w16cex="http://schemas.microsoft.com/office/word/2018/wordml/cex" xmlns:w16cid="http://schemas.microsoft.com/office/word/2016/wordml/cid" xmlns:w16="http://schemas.microsoft.com/office/word/2018/wordml" xmlns:w16du="http://schemas.microsoft.com/office/word/2023/wordml/word16du" xmlns:w16sdtdh="http://schemas.microsoft.com/office/word/2020/wordml/sdtdatahash" xmlns:w16sdtfl="http://schemas.microsoft.com/office/word/2024/wordml/sdtformatlock" xmlns:w16se="http://schemas.microsoft.com/office/word/2015/wordml/symex" xmlns:wpg="http://schemas.microsoft.com/office/word/2010/wordprocessingGroup" xmlns:wpi="http://schemas.microsoft.com/office/word/2010/wordprocessingInk" xmlns:wne="http://schemas.microsoft.com/office/word/2006/wordml" xmlns:wps="http://schemas.microsoft.com/office/word/2010/wordprocessingShape" mc:Ignorable="w14 w15 w16se w16cid w16 w16cex w16sdtdh w16sdtfl w16du wp14">
   <w:abstractNum w:abstractNumId="0" w15:restartNumberingAfterBreak="0">
     <w:nsid w:val="0C9200D7"/>
     <w:multiLevelType w:val="multilevel"/>
@@ -7578,7 +6620,7 @@
 </file>
 
 <file path=word/styles.xml><?xml version="1.0" encoding="utf-8"?>
-<w:styles xmlns:mc="http://schemas.openxmlformats.org/markup-compatibility/2006" xmlns:r="http://schemas.openxmlformats.org/officeDocument/2006/relationships" xmlns:w="http://schemas.openxmlformats.org/wordprocessingml/2006/main" xmlns:w14="http://schemas.microsoft.com/office/word/2010/wordml" xmlns:w15="http://schemas.microsoft.com/office/word/2012/wordml" xmlns:w16cex="http://schemas.microsoft.com/office/word/2018/wordml/cex" xmlns:w16cid="http://schemas.microsoft.com/office/word/2016/wordml/cid" xmlns:w16="http://schemas.microsoft.com/office/word/2018/wordml" xmlns:w16du="http://schemas.microsoft.com/office/word/2023/wordml/word16du" xmlns:w16sdtdh="http://schemas.microsoft.com/office/word/2020/wordml/sdtdatahash" xmlns:w16se="http://schemas.microsoft.com/office/word/2015/wordml/symex" mc:Ignorable="w14 w15 w16se w16cid w16 w16cex w16sdtdh w16du">
+<w:styles xmlns:mc="http://schemas.openxmlformats.org/markup-compatibility/2006" xmlns:r="http://schemas.openxmlformats.org/officeDocument/2006/relationships" xmlns:w="http://schemas.openxmlformats.org/wordprocessingml/2006/main" xmlns:w14="http://schemas.microsoft.com/office/word/2010/wordml" xmlns:w15="http://schemas.microsoft.com/office/word/2012/wordml" xmlns:w16cex="http://schemas.microsoft.com/office/word/2018/wordml/cex" xmlns:w16cid="http://schemas.microsoft.com/office/word/2016/wordml/cid" xmlns:w16="http://schemas.microsoft.com/office/word/2018/wordml" xmlns:w16du="http://schemas.microsoft.com/office/word/2023/wordml/word16du" xmlns:w16sdtdh="http://schemas.microsoft.com/office/word/2020/wordml/sdtdatahash" xmlns:w16sdtfl="http://schemas.microsoft.com/office/word/2024/wordml/sdtformatlock" xmlns:w16se="http://schemas.microsoft.com/office/word/2015/wordml/symex" mc:Ignorable="w14 w15 w16se w16cid w16 w16cex w16sdtdh w16sdtfl w16du">
   <w:docDefaults>
     <w:rPrDefault>
       <w:rPr>

</xml_diff>